<commit_message>
docs: ý kiến Phòng TCCB&CTHSSV 06/10/2026 về quy ước tính điểm sản phẩm — đóng tồn tại (5), câu hỏi mở KPI #1
Co-Authored-By: Claude Opus 5.5 <noreply@anthropic.com>
</commit_message>
<xml_diff>
--- a/30-Ket-Qua/2026-10-05/Soan-Thao/PXYK_Quy-uoc-tinh-diem-san-pham-KTC-Quan-tri_gui-Phong-TCCB-CTHSSV_20261005_v1.docx
+++ b/30-Ket-Qua/2026-10-05/Soan-Thao/PXYK_Quy-uoc-tinh-diem-san-pham-KTC-Quan-tri_gui-Phong-TCCB-CTHSSV_20261005_v1.docx
@@ -1,6 +1,6 @@
 
 <file path=word/document.xml><?xml version="1.0" encoding="utf-8"?>
-<w:document xmlns:wpc="http://schemas.microsoft.com/office/word/2010/wordprocessingCanvas" xmlns:cx="http://schemas.microsoft.com/office/drawing/2014/chartex" xmlns:cx1="http://schemas.microsoft.com/office/drawing/2015/9/8/chartex" xmlns:cx2="http://schemas.microsoft.com/office/drawing/2015/10/21/chartex" xmlns:cx3="http://schemas.microsoft.com/office/drawing/2016/5/9/chartex" xmlns:cx4="http://schemas.microsoft.com/office/drawing/2016/5/10/chartex" xmlns:cx5="http://schemas.microsoft.com/office/drawing/2016/5/11/chartex" xmlns:cx6="http://schemas.microsoft.com/office/drawing/2016/5/12/chartex" xmlns:cx7="http://schemas.microsoft.com/office/drawing/2016/5/13/chartex" xmlns:cx8="http://schemas.microsoft.com/office/drawing/2016/5/14/chartex" xmlns:mc="http://schemas.openxmlformats.org/markup-compatibility/2006" xmlns:aink="http://schemas.microsoft.com/office/drawing/2016/ink" xmlns:am3d="http://schemas.microsoft.com/office/drawing/2017/model3d" xmlns:o="urn:schemas-microsoft-com:office:office" xmlns:oel="http://schemas.microsoft.com/office/2019/extlst" xmlns:r="http://schemas.openxmlformats.org/officeDocument/2006/relationships" xmlns:m="http://schemas.openxmlformats.org/officeDocument/2006/math" xmlns:v="urn:schemas-microsoft-com:vml" xmlns:wp14="http://schemas.microsoft.com/office/word/2010/wordprocessingDrawing" xmlns:wp="http://schemas.openxmlformats.org/drawingml/2006/wordprocessingDrawing" xmlns:w10="urn:schemas-microsoft-com:office:word" xmlns:w="http://schemas.openxmlformats.org/wordprocessingml/2006/main" xmlns:w14="http://schemas.microsoft.com/office/word/2010/wordml" xmlns:w15="http://schemas.microsoft.com/office/word/2012/wordml" xmlns:w16cex="http://schemas.microsoft.com/office/word/2018/wordml/cex" xmlns:w16cid="http://schemas.microsoft.com/office/word/2016/wordml/cid" xmlns:w16="http://schemas.microsoft.com/office/word/2018/wordml" xmlns:w16du="http://schemas.microsoft.com/office/word/2023/wordml/word16du" xmlns:w16sdtdh="http://schemas.microsoft.com/office/word/2020/wordml/sdtdatahash" xmlns:w16sdtfl="http://schemas.microsoft.com/office/word/2024/wordml/sdtformatlock" xmlns:w16se="http://schemas.microsoft.com/office/word/2015/wordml/symex" xmlns:wpg="http://schemas.microsoft.com/office/word/2010/wordprocessingGroup" xmlns:wpi="http://schemas.microsoft.com/office/word/2010/wordprocessingInk" xmlns:wne="http://schemas.microsoft.com/office/word/2006/wordml" xmlns:wps="http://schemas.microsoft.com/office/word/2010/wordprocessingShape" mc:Ignorable="w14 w15 w16se w16cid w16 w16cex w16sdtdh w16sdtfl w16du wp14">
+<w:document xmlns:wpc="http://schemas.microsoft.com/office/word/2010/wordprocessingCanvas" xmlns:cx="http://schemas.microsoft.com/office/drawing/2014/chartex" xmlns:cx1="http://schemas.microsoft.com/office/drawing/2015/9/8/chartex" xmlns:cx2="http://schemas.microsoft.com/office/drawing/2015/10/21/chartex" xmlns:cx3="http://schemas.microsoft.com/office/drawing/2016/5/9/chartex" xmlns:cx4="http://schemas.microsoft.com/office/drawing/2016/5/10/chartex" xmlns:cx5="http://schemas.microsoft.com/office/drawing/2016/5/11/chartex" xmlns:cx6="http://schemas.microsoft.com/office/drawing/2016/5/12/chartex" xmlns:cx7="http://schemas.microsoft.com/office/drawing/2016/5/13/chartex" xmlns:cx8="http://schemas.microsoft.com/office/drawing/2016/5/14/chartex" xmlns:mc="http://schemas.openxmlformats.org/markup-compatibility/2006" xmlns:aink="http://schemas.microsoft.com/office/drawing/2016/ink" xmlns:am3d="http://schemas.microsoft.com/office/drawing/2017/model3d" xmlns:o="urn:schemas-microsoft-com:office:office" xmlns:oel="http://schemas.microsoft.com/office/2019/extlst" xmlns:r="http://schemas.openxmlformats.org/officeDocument/2006/relationships" xmlns:m="http://schemas.openxmlformats.org/officeDocument/2006/math" xmlns:v="urn:schemas-microsoft-com:vml" xmlns:wp14="http://schemas.microsoft.com/office/word/2010/wordprocessingDrawing" xmlns:wp="http://schemas.openxmlformats.org/drawingml/2006/wordprocessingDrawing" xmlns:w10="urn:schemas-microsoft-com:office:word" xmlns:w="http://schemas.openxmlformats.org/wordprocessingml/2006/main" xmlns:w14="http://schemas.microsoft.com/office/word/2010/wordml" xmlns:w15="http://schemas.microsoft.com/office/word/2012/wordml" xmlns:w16cex="http://schemas.microsoft.com/office/word/2018/wordml/cex" xmlns:w16cid="http://schemas.microsoft.com/office/word/2016/wordml/cid" xmlns:w16="http://schemas.microsoft.com/office/word/2018/wordml" xmlns:w16du="http://schemas.microsoft.com/office/word/2023/wordml/word16du" xmlns:w16sdtdh="http://schemas.microsoft.com/office/word/2020/wordml/sdtdatahash" xmlns:w16se="http://schemas.microsoft.com/office/word/2015/wordml/symex" xmlns:wpg="http://schemas.microsoft.com/office/word/2010/wordprocessingGroup" xmlns:wpi="http://schemas.microsoft.com/office/word/2010/wordprocessingInk" xmlns:wne="http://schemas.microsoft.com/office/word/2006/wordml" xmlns:wps="http://schemas.microsoft.com/office/word/2010/wordprocessingShape" mc:Ignorable="w14 w15 w16se w16cid w16 w16cex w16sdtdh wp14">
   <w:body>
     <w:tbl>
       <w:tblPr>
@@ -120,7 +120,7 @@
                     </wp:anchor>
                   </w:drawing>
                 </mc:Choice>
-                <mc:Fallback>
+                <mc:Fallback xmlns:w16sdtfl="http://schemas.microsoft.com/office/word/2024/wordml/sdtformatlock">
                   <w:pict>
                     <v:line w14:anchorId="5528097D" id="Straight Connector 9" o:spid="_x0000_s1026" style="position:absolute;z-index:251665408;visibility:visible;mso-wrap-style:square;mso-wrap-distance-left:9pt;mso-wrap-distance-top:0;mso-wrap-distance-right:9pt;mso-wrap-distance-bottom:0;mso-position-horizontal:absolute;mso-position-horizontal-relative:text;mso-position-vertical:absolute;mso-position-vertical-relative:text" from="69.1pt,16.5pt" to="126.55pt,16.5pt" o:gfxdata="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" strokecolor="black [3200]" strokeweight=".5pt">
                       <v:stroke joinstyle="miter"/>
@@ -231,7 +231,7 @@
                     </wp:anchor>
                   </w:drawing>
                 </mc:Choice>
-                <mc:Fallback>
+                <mc:Fallback xmlns:w16sdtfl="http://schemas.microsoft.com/office/word/2024/wordml/sdtformatlock">
                   <w:pict>
                     <v:line w14:anchorId="7A419A33" id="Đường nối Thẳng 4" o:spid="_x0000_s1026" style="position:absolute;flip:y;z-index:251662336;visibility:visible;mso-wrap-style:square;mso-width-percent:0;mso-height-percent:0;mso-wrap-distance-left:9pt;mso-wrap-distance-top:0;mso-wrap-distance-right:9pt;mso-wrap-distance-bottom:0;mso-position-horizontal:absolute;mso-position-horizontal-relative:text;mso-position-vertical:absolute;mso-position-vertical-relative:text;mso-width-percent:0;mso-height-percent:0;mso-width-relative:page;mso-height-relative:page" from="55.15pt,18pt" to="219pt,18.05pt" o:gfxdata="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" strokeweight=".5pt"/>
                   </w:pict>
@@ -303,7 +303,7 @@
                 <w:szCs w:val="28"/>
                 <w:lang w:val="nl-NL"/>
               </w:rPr>
-              <w:t xml:space="preserve">Quảng Ngãi, ngày      tháng 10 năm 2026</w:t>
+              <w:t>Quảng Ngãi, ngày      tháng 10 năm 2026</w:t>
             </w:r>
           </w:p>
         </w:tc>
@@ -338,7 +338,7 @@
           <w:szCs w:val="28"/>
           <w:lang w:val="nl-NL"/>
         </w:rPr>
-        <w:t xml:space="preserve">PHIẾU XIN Ý KIẾN</w:t>
+        <w:t>PHIẾU XIN Ý KIẾN</w:t>
       </w:r>
     </w:p>
     <w:p>
@@ -361,11 +361,29 @@
           <w:sz w:val="28"/>
           <w:szCs w:val="28"/>
         </w:rPr>
-        <w:t xml:space="preserve">Quy ước tính điểm sản phẩm, công việc trong bộ công cụ trí tuệ nhân tạo KTC</w:t>
+        <w:t>Quy ước tính điểm sản phẩm, công việc trong bộ công cụ trí tuệ nhân tạo KTC</w:t>
+      </w:r>
+      <w:r>
+        <w:rPr>
+          <w:b/>
+          <w:bCs/>
+          <w:color w:val="000000"/>
+          <w:sz w:val="28"/>
+          <w:szCs w:val="28"/>
+        </w:rPr>
         <w:noBreakHyphen/>
-        <w:t xml:space="preserve">Quan</w:t>
+        <w:t>Quan</w:t>
+      </w:r>
+      <w:r>
+        <w:rPr>
+          <w:b/>
+          <w:bCs/>
+          <w:color w:val="000000"/>
+          <w:sz w:val="28"/>
+          <w:szCs w:val="28"/>
+        </w:rPr>
         <w:noBreakHyphen/>
-        <w:t xml:space="preserve">tri</w:t>
+        <w:t>tri</w:t>
       </w:r>
     </w:p>
     <w:p>
@@ -448,7 +466,7 @@
               </wp:anchor>
             </w:drawing>
           </mc:Choice>
-          <mc:Fallback>
+          <mc:Fallback xmlns:w16sdtfl="http://schemas.microsoft.com/office/word/2024/wordml/sdtformatlock">
             <w:pict>
               <v:shapetype w14:anchorId="13002F5E" id="_x0000_t32" coordsize="21600,21600" o:spt="32" o:oned="t" path="m,l21600,21600e" filled="f">
                 <v:path arrowok="t" fillok="f" o:connecttype="none"/>
@@ -478,7 +496,7 @@
           <w:szCs w:val="28"/>
           <w:lang w:val="nl-NL"/>
         </w:rPr>
-        <w:t xml:space="preserve">Kính gửi: Phòng TCCB&amp;CTHSSV.</w:t>
+        <w:t>Kính gửi: Phòng TCCB&amp;CTHSSV.</w:t>
       </w:r>
     </w:p>
     <w:p>
@@ -506,9 +524,9 @@
       </w:pPr>
       <w:r>
         <w:rPr>
-          <w:sz w:val="28"/>
-          <w:szCs w:val="28"/>
           <w:b/>
+          <w:sz w:val="28"/>
+          <w:szCs w:val="28"/>
         </w:rPr>
         <w:t xml:space="preserve">* Đơn vị xin ý kiến: </w:t>
       </w:r>
@@ -516,11 +534,16 @@
         <w:rPr>
           <w:sz w:val="28"/>
           <w:szCs w:val="28"/>
-          <w:b w:val="0"/>
-        </w:rPr>
-        <w:t xml:space="preserve">Phòng TH</w:t>
+        </w:rPr>
+        <w:t>Phòng TH</w:t>
+      </w:r>
+      <w:r>
+        <w:rPr>
+          <w:sz w:val="28"/>
+          <w:szCs w:val="28"/>
+        </w:rPr>
         <w:noBreakHyphen/>
-        <w:t xml:space="preserve">HC&amp;QT.</w:t>
+        <w:t>HC&amp;QT.</w:t>
       </w:r>
     </w:p>
     <w:p>
@@ -536,9 +559,9 @@
       </w:pPr>
       <w:r>
         <w:rPr>
-          <w:sz w:val="28"/>
-          <w:szCs w:val="28"/>
           <w:b/>
+          <w:sz w:val="28"/>
+          <w:szCs w:val="28"/>
         </w:rPr>
         <w:t xml:space="preserve">1. Nội dung xin ý kiến: </w:t>
       </w:r>
@@ -546,13 +569,24 @@
         <w:rPr>
           <w:sz w:val="28"/>
           <w:szCs w:val="28"/>
-          <w:b w:val="0"/>
-        </w:rPr>
-        <w:t xml:space="preserve">Quy ước tính điểm (quy đổi khối lượng) sản phẩm, công việc khi lập kế hoạch, tự đánh giá KPI cá nhân bằng bộ công cụ trí tuệ nhân tạo KTC</w:t>
+        </w:rPr>
+        <w:t>Quy ước tính điểm (quy đổi khối lượng) sản phẩm, công việc khi lập kế hoạch, tự đánh giá KPI cá nhân bằng bộ công cụ trí tuệ nhân tạo KTC</w:t>
+      </w:r>
+      <w:r>
+        <w:rPr>
+          <w:sz w:val="28"/>
+          <w:szCs w:val="28"/>
+        </w:rPr>
         <w:noBreakHyphen/>
-        <w:t xml:space="preserve">Quan</w:t>
+        <w:t>Quan</w:t>
+      </w:r>
+      <w:r>
+        <w:rPr>
+          <w:sz w:val="28"/>
+          <w:szCs w:val="28"/>
+        </w:rPr>
         <w:noBreakHyphen/>
-        <w:t xml:space="preserve">tri.</w:t>
+        <w:t>tri.</w:t>
       </w:r>
     </w:p>
     <w:p>
@@ -568,9 +602,9 @@
       </w:pPr>
       <w:r>
         <w:rPr>
-          <w:sz w:val="28"/>
-          <w:szCs w:val="28"/>
           <w:b/>
+          <w:sz w:val="28"/>
+          <w:szCs w:val="28"/>
         </w:rPr>
         <w:t xml:space="preserve">2. Lý do xin ý kiến: </w:t>
       </w:r>
@@ -578,13 +612,24 @@
         <w:rPr>
           <w:sz w:val="28"/>
           <w:szCs w:val="28"/>
-          <w:b w:val="0"/>
-        </w:rPr>
-        <w:t xml:space="preserve">Thực hiện ý kiến chỉ đạo của Hiệu trưởng ngày 04/10/2026 tại Phiếu trình ngày 03/10/2026 của phòng QLKHCN&amp;HTPT về kết quả rà soát thẩm định việc xây dựng bộ công cụ KTC</w:t>
+        </w:rPr>
+        <w:t>Thực hiện ý kiến chỉ đạo của Hiệu trưởng ngày 04/10/2026 tại Phiếu trình ngày 03/10/2026 của phòng QLKHCN&amp;HTPT về kết quả rà soát thẩm định việc xây dựng bộ công cụ KTC</w:t>
+      </w:r>
+      <w:r>
+        <w:rPr>
+          <w:sz w:val="28"/>
+          <w:szCs w:val="28"/>
+        </w:rPr>
         <w:noBreakHyphen/>
-        <w:t xml:space="preserve">quan</w:t>
+        <w:t>quan</w:t>
+      </w:r>
+      <w:r>
+        <w:rPr>
+          <w:sz w:val="28"/>
+          <w:szCs w:val="28"/>
+        </w:rPr>
         <w:noBreakHyphen/>
-        <w:t xml:space="preserve">tri, trong đó nêu nội dung còn tồn tại: Quy ước nhân hệ số sản phẩm với hệ số mức độ công việc còn chờ ý kiến phòng TCCB&amp;CTHSSV.</w:t>
+        <w:t>tri, trong đó nêu nội dung còn tồn tại: Quy ước nhân hệ số sản phẩm với hệ số mức độ công việc còn chờ ý kiến phòng TCCB&amp;CTHSSV.</w:t>
       </w:r>
     </w:p>
     <w:p>
@@ -607,7 +652,7 @@
           <w:szCs w:val="28"/>
           <w:shd w:val="clear" w:color="auto" w:fill="FFFFFF"/>
         </w:rPr>
-        <w:t xml:space="preserve">Hiện nay có 02 văn bản quy định hệ số quy đổi:</w:t>
+        <w:t>Hiện nay có 02 văn bản quy định hệ số quy đổi:</w:t>
       </w:r>
     </w:p>
     <w:p>
@@ -630,9 +675,16 @@
           <w:szCs w:val="28"/>
           <w:shd w:val="clear" w:color="auto" w:fill="FFFFFF"/>
         </w:rPr>
-        <w:t xml:space="preserve">- Quyết định số 1923/QĐ</w:t>
+        <w:t>- Quyết định số 1923/QĐ</w:t>
+      </w:r>
+      <w:r>
+        <w:rPr>
+          <w:sz w:val="28"/>
+          <w:szCs w:val="28"/>
+          <w:shd w:val="clear" w:color="auto" w:fill="FFFFFF"/>
+        </w:rPr>
         <w:noBreakHyphen/>
-        <w:t xml:space="preserve">CĐKT ngày 30/8/2026 của Hiệu trưởng Trường Cao đẳng Kon Tum ban hành Quy chế đánh giá, xếp loại chất lượng tập thể, cá nhân gắn với Chỉ số đánh giá hiệu quả công việc (KPI) (Phụ lục I, Phụ lục II): Hệ số theo 04 mức độ công việc, gồm Thấp 1,0; Trung bình 1,2; Cao 1,5; Khó, phức tạp 2,0 (điểm chấm công việc tương ứng 100, 120, 150, 200).</w:t>
+        <w:t>CĐKT ngày 30/8/2026 của Hiệu trưởng Trường Cao đẳng Kon Tum ban hành Quy chế đánh giá, xếp loại chất lượng tập thể, cá nhân gắn với Chỉ số đánh giá hiệu quả công việc (KPI) (Phụ lục I, Phụ lục II): Hệ số theo 04 mức độ công việc, gồm Thấp 1,0; Trung bình 1,2; Cao 1,5; Khó, phức tạp 2,0 (điểm chấm công việc tương ứng 100, 120, 150, 200).</w:t>
       </w:r>
     </w:p>
     <w:p>
@@ -655,9 +707,16 @@
           <w:szCs w:val="28"/>
           <w:shd w:val="clear" w:color="auto" w:fill="FFFFFF"/>
         </w:rPr>
-        <w:t xml:space="preserve">- Quyết định số 2119/QĐ</w:t>
+        <w:t>- Quyết định số 2119/QĐ</w:t>
+      </w:r>
+      <w:r>
+        <w:rPr>
+          <w:sz w:val="28"/>
+          <w:szCs w:val="28"/>
+          <w:shd w:val="clear" w:color="auto" w:fill="FFFFFF"/>
+        </w:rPr>
         <w:noBreakHyphen/>
-        <w:t xml:space="preserve">CĐKT ngày 28/9/2026 của Hiệu trưởng Trường Cao đẳng Kon Tum ban hành Danh mục sản phẩm, công việc: Hệ số theo từng sản phẩm, công việc (416 sản phẩm, hệ số từ 0,3 đến 4,5); Điều 2 quy định Danh mục là cơ sở để các đơn vị, viên chức, người lao động xây dựng kế hoạch công tác, phục vụ đánh giá, xếp loại chất lượng theo quý, hằng năm.</w:t>
+        <w:t>CĐKT ngày 28/9/2026 của Hiệu trưởng Trường Cao đẳng Kon Tum ban hành Danh mục sản phẩm, công việc: Hệ số theo từng sản phẩm, công việc (416 sản phẩm, hệ số từ 0,3 đến 4,5); Điều 2 quy định Danh mục là cơ sở để các đơn vị, viên chức, người lao động xây dựng kế hoạch công tác, phục vụ đánh giá, xếp loại chất lượng theo quý, hằng năm.</w:t>
       </w:r>
     </w:p>
     <w:p>
@@ -680,13 +739,43 @@
           <w:szCs w:val="28"/>
           <w:shd w:val="clear" w:color="auto" w:fill="FFFFFF"/>
         </w:rPr>
-        <w:t xml:space="preserve">Hai văn bản chưa quy định cách kết hợp hai loại hệ số; Quyết định số 2119/QĐ</w:t>
+        <w:t xml:space="preserve">Hai văn bản chưa quy định cách kết hợp hai loại hệ số; Quyết định số </w:t>
+      </w:r>
+      <w:r>
+        <w:rPr>
+          <w:sz w:val="28"/>
+          <w:szCs w:val="28"/>
+          <w:shd w:val="clear" w:color="auto" w:fill="FFFFFF"/>
+        </w:rPr>
+        <w:lastRenderedPageBreak/>
+        <w:t>2119/QĐ</w:t>
+      </w:r>
+      <w:r>
+        <w:rPr>
+          <w:sz w:val="28"/>
+          <w:szCs w:val="28"/>
+          <w:shd w:val="clear" w:color="auto" w:fill="FFFFFF"/>
+        </w:rPr>
         <w:noBreakHyphen/>
-        <w:t xml:space="preserve">CĐKT không sửa đổi mẫu Phụ lục I, Phụ lục II kèm theo Quyết định số 1923/QĐ</w:t>
+        <w:t>CĐKT không sửa đổi mẫu Phụ lục I, Phụ lục II kèm theo Quyết định số 1923/QĐ</w:t>
+      </w:r>
+      <w:r>
+        <w:rPr>
+          <w:sz w:val="28"/>
+          <w:szCs w:val="28"/>
+          <w:shd w:val="clear" w:color="auto" w:fill="FFFFFF"/>
+        </w:rPr>
         <w:noBreakHyphen/>
-        <w:t xml:space="preserve">CĐKT. Ngoài ra, Điều 3 Quyết định số 2164/QĐ</w:t>
+        <w:t>CĐKT. Ngoài ra, Điều 3 Quyết định số 2164/QĐ</w:t>
+      </w:r>
+      <w:r>
+        <w:rPr>
+          <w:sz w:val="28"/>
+          <w:szCs w:val="28"/>
+          <w:shd w:val="clear" w:color="auto" w:fill="FFFFFF"/>
+        </w:rPr>
         <w:noBreakHyphen/>
-        <w:t xml:space="preserve">CĐKT ngày 30/9/2026 của Hiệu trưởng Trường Cao đẳng Kon Tum ban hành Bộ chỉ số KPI đối với tập thể và cá nhân quy định tổng trọng số các chỉ tiêu trong mỗi bộ KPI của tập thể, cá nhân phải bằng 100%, nhưng các phụ lục chưa có cột trọng số.</w:t>
+        <w:t>CĐKT ngày 30/9/2026 của Hiệu trưởng Trường Cao đẳng Kon Tum ban hành Bộ chỉ số KPI đối với tập thể và cá nhân quy định tổng trọng số các chỉ tiêu trong mỗi bộ KPI của tập thể, cá nhân phải bằng 100%, nhưng các phụ lục chưa có cột trọng số.</w:t>
       </w:r>
     </w:p>
     <w:p>
@@ -709,7 +798,7 @@
           <w:szCs w:val="28"/>
           <w:shd w:val="clear" w:color="auto" w:fill="FFFFFF"/>
         </w:rPr>
-        <w:t xml:space="preserve">Trong thời gian chờ ý kiến, Bộ công cụ không tự chọn quy ước: Người lập kế hoạch chọn 01 trong các phương án nêu tại Mục 3, kết quả ghi rõ phương án đã chọn và trạng thái chưa có hướng dẫn.</w:t>
+        <w:t>Trong thời gian chờ ý kiến, Bộ công cụ không tự chọn quy ước: Người lập kế hoạch chọn 01 trong các phương án nêu tại Mục 3, kết quả ghi rõ phương án đã chọn và trạng thái chưa có hướng dẫn.</w:t>
       </w:r>
     </w:p>
     <w:p>
@@ -725,19 +814,19 @@
       </w:pPr>
       <w:r>
         <w:rPr>
-          <w:sz w:val="28"/>
-          <w:szCs w:val="28"/>
           <w:b/>
-        </w:rPr>
-        <w:t xml:space="preserve">3. Nội dung đề nghị phòng TCCB&amp;CTHSSV cho ý kiến:</w:t>
+          <w:sz w:val="28"/>
+          <w:szCs w:val="28"/>
+        </w:rPr>
+        <w:t>3. Nội dung đề nghị phòng TCCB&amp;CTHSSV cho ý kiến:</w:t>
       </w:r>
     </w:p>
     <w:tbl>
       <w:tblPr>
+        <w:tblW w:w="9069" w:type="dxa"/>
         <w:jc w:val="center"/>
         <w:tblLayout w:type="fixed"/>
         <w:tblLook w:val="04A0" w:firstRow="1" w:lastRow="0" w:firstColumn="1" w:lastColumn="0" w:noHBand="0" w:noVBand="1"/>
-        <w:tblW w:w="9069" w:type="dxa"/>
       </w:tblPr>
       <w:tblGrid>
         <w:gridCol w:w="544"/>
@@ -747,10 +836,9 @@
       </w:tblGrid>
       <w:tr>
         <w:trPr>
+          <w:cantSplit/>
           <w:tblHeader/>
           <w:jc w:val="center"/>
-          <w:cantSplit/>
-          <w:tblHeader/>
         </w:trPr>
         <w:tc>
           <w:tcPr>
@@ -766,23 +854,19 @@
           </w:tcPr>
           <w:p>
             <w:pPr>
+              <w:keepNext/>
+              <w:spacing w:before="40" w:after="40"/>
+              <w:jc w:val="center"/>
               <w:rPr>
                 <w:b/>
                 <w:bCs/>
-                <w:sz w:val="24"/>
-                <w:szCs w:val="24"/>
-              </w:rPr>
-              <w:jc w:val="center"/>
-              <w:spacing w:before="40" w:after="40" w:line="240" w:lineRule="auto"/>
-              <w:keepNext/>
-            </w:pPr>
-            <w:r>
-              <w:rPr>
-                <w:sz w:val="24"/>
-                <w:szCs w:val="24"/>
+              </w:rPr>
+            </w:pPr>
+            <w:r>
+              <w:rPr>
                 <w:b/>
               </w:rPr>
-              <w:t xml:space="preserve">TT</w:t>
+              <w:t>TT</w:t>
             </w:r>
           </w:p>
         </w:tc>
@@ -800,23 +884,19 @@
           </w:tcPr>
           <w:p>
             <w:pPr>
+              <w:keepNext/>
+              <w:spacing w:before="40" w:after="40"/>
+              <w:jc w:val="center"/>
               <w:rPr>
                 <w:b/>
                 <w:bCs/>
-                <w:sz w:val="24"/>
-                <w:szCs w:val="24"/>
-              </w:rPr>
-              <w:jc w:val="center"/>
-              <w:spacing w:before="40" w:after="40" w:line="240" w:lineRule="auto"/>
-              <w:keepNext/>
-            </w:pPr>
-            <w:r>
-              <w:rPr>
-                <w:sz w:val="24"/>
-                <w:szCs w:val="24"/>
+              </w:rPr>
+            </w:pPr>
+            <w:r>
+              <w:rPr>
                 <w:b/>
               </w:rPr>
-              <w:t xml:space="preserve">Nội dung</w:t>
+              <w:t>Nội dung</w:t>
             </w:r>
           </w:p>
         </w:tc>
@@ -834,23 +914,19 @@
           </w:tcPr>
           <w:p>
             <w:pPr>
+              <w:keepNext/>
+              <w:spacing w:before="40" w:after="40"/>
+              <w:jc w:val="center"/>
               <w:rPr>
                 <w:b/>
                 <w:bCs/>
-                <w:sz w:val="24"/>
-                <w:szCs w:val="24"/>
-              </w:rPr>
-              <w:jc w:val="center"/>
-              <w:spacing w:before="40" w:after="40" w:line="240" w:lineRule="auto"/>
-              <w:keepNext/>
-            </w:pPr>
-            <w:r>
-              <w:rPr>
-                <w:sz w:val="24"/>
-                <w:szCs w:val="24"/>
+              </w:rPr>
+            </w:pPr>
+            <w:r>
+              <w:rPr>
                 <w:b/>
               </w:rPr>
-              <w:t xml:space="preserve">Phương án</w:t>
+              <w:t>Phương án</w:t>
             </w:r>
           </w:p>
         </w:tc>
@@ -868,31 +944,27 @@
           </w:tcPr>
           <w:p>
             <w:pPr>
+              <w:keepNext/>
+              <w:spacing w:before="40" w:after="40"/>
+              <w:jc w:val="center"/>
               <w:rPr>
                 <w:b/>
                 <w:bCs/>
-                <w:sz w:val="24"/>
-                <w:szCs w:val="24"/>
-              </w:rPr>
-              <w:jc w:val="center"/>
-              <w:spacing w:before="40" w:after="40" w:line="240" w:lineRule="auto"/>
-              <w:keepNext/>
-            </w:pPr>
-            <w:r>
-              <w:rPr>
-                <w:sz w:val="24"/>
-                <w:szCs w:val="24"/>
+              </w:rPr>
+            </w:pPr>
+            <w:r>
+              <w:rPr>
                 <w:b/>
               </w:rPr>
-              <w:t xml:space="preserve">Ý kiến của phòng TCCB&amp;CTHSSV</w:t>
+              <w:t>Ý kiến của phòng TCCB&amp;CTHSSV</w:t>
             </w:r>
           </w:p>
         </w:tc>
       </w:tr>
       <w:tr>
         <w:trPr>
+          <w:cantSplit/>
           <w:jc w:val="center"/>
-          <w:cantSplit/>
         </w:trPr>
         <w:tc>
           <w:tcPr>
@@ -909,22 +981,17 @@
           </w:tcPr>
           <w:p>
             <w:pPr>
-              <w:rPr>
-                <w:color w:val="000000"/>
-                <w:sz w:val="24"/>
-                <w:szCs w:val="24"/>
-              </w:rPr>
+              <w:spacing w:before="40" w:after="40"/>
               <w:jc w:val="center"/>
-              <w:spacing w:before="40" w:after="40" w:line="240" w:lineRule="auto"/>
-            </w:pPr>
-            <w:r>
-              <w:rPr>
-                <w:color w:val="000000"/>
-                <w:sz w:val="24"/>
-                <w:szCs w:val="24"/>
-                <w:b w:val="0"/>
-              </w:rPr>
-              <w:t xml:space="preserve">1</w:t>
+              <w:rPr>
+                <w:color w:val="000000"/>
+              </w:rPr>
+            </w:pPr>
+            <w:r>
+              <w:rPr>
+                <w:color w:val="000000"/>
+              </w:rPr>
+              <w:t>1</w:t>
             </w:r>
           </w:p>
         </w:tc>
@@ -943,22 +1010,16 @@
           </w:tcPr>
           <w:p>
             <w:pPr>
-              <w:rPr>
-                <w:color w:val="000000"/>
-                <w:sz w:val="24"/>
-                <w:szCs w:val="24"/>
-              </w:rPr>
-              <w:jc w:val="left"/>
-              <w:spacing w:before="40" w:after="40" w:line="240" w:lineRule="auto"/>
-            </w:pPr>
-            <w:r>
-              <w:rPr>
-                <w:color w:val="000000"/>
-                <w:sz w:val="24"/>
-                <w:szCs w:val="24"/>
-                <w:b w:val="0"/>
-              </w:rPr>
-              <w:t xml:space="preserve">Cách quy đổi khối lượng sản phẩm, công việc của cá nhân</w:t>
+              <w:spacing w:before="40" w:after="40"/>
+              <w:rPr>
+                <w:color w:val="000000"/>
+              </w:rPr>
+            </w:pPr>
+            <w:r>
+              <w:rPr>
+                <w:color w:val="000000"/>
+              </w:rPr>
+              <w:t>Cách quy đổi khối lượng sản phẩm, công việc của cá nhân</w:t>
             </w:r>
           </w:p>
         </w:tc>
@@ -977,86 +1038,72 @@
           </w:tcPr>
           <w:p>
             <w:pPr>
-              <w:rPr>
-                <w:color w:val="000000"/>
-                <w:sz w:val="24"/>
-                <w:szCs w:val="24"/>
-              </w:rPr>
-              <w:jc w:val="left"/>
-              <w:spacing w:before="40" w:after="40" w:line="240" w:lineRule="auto"/>
-            </w:pPr>
-            <w:r>
-              <w:rPr>
-                <w:color w:val="000000"/>
-                <w:sz w:val="24"/>
-                <w:szCs w:val="24"/>
-                <w:b w:val="0"/>
-              </w:rPr>
-              <w:t xml:space="preserve">a) Chỉ theo hệ số mức độ công việc (Quyết định số 1923/QĐ</w:t>
+              <w:spacing w:before="40" w:after="40"/>
+              <w:rPr>
+                <w:color w:val="000000"/>
+              </w:rPr>
+            </w:pPr>
+            <w:r>
+              <w:rPr>
+                <w:color w:val="000000"/>
+              </w:rPr>
+              <w:t>a) Chỉ theo hệ số mức độ công việc (Quyết định số 1923/QĐ</w:t>
+            </w:r>
+            <w:r>
+              <w:rPr>
+                <w:color w:val="000000"/>
+              </w:rPr>
               <w:noBreakHyphen/>
-              <w:t xml:space="preserve">CĐKT)</w:t>
-            </w:r>
-          </w:p>
-          <w:p>
-            <w:pPr>
-              <w:rPr>
-                <w:color w:val="000000"/>
-                <w:sz w:val="24"/>
-                <w:szCs w:val="24"/>
-              </w:rPr>
-              <w:jc w:val="left"/>
-              <w:spacing w:before="40" w:after="40" w:line="240" w:lineRule="auto"/>
-            </w:pPr>
-            <w:r>
-              <w:rPr>
-                <w:color w:val="000000"/>
-                <w:sz w:val="24"/>
-                <w:szCs w:val="24"/>
-                <w:b w:val="0"/>
-              </w:rPr>
-              <w:t xml:space="preserve">b) Chỉ theo hệ số sản phẩm (Quyết định số 2119/QĐ</w:t>
+              <w:t>CĐKT)</w:t>
+            </w:r>
+          </w:p>
+          <w:p>
+            <w:pPr>
+              <w:spacing w:before="40" w:after="40"/>
+              <w:rPr>
+                <w:color w:val="000000"/>
+              </w:rPr>
+            </w:pPr>
+            <w:r>
+              <w:rPr>
+                <w:color w:val="000000"/>
+              </w:rPr>
+              <w:t>b) Chỉ theo hệ số sản phẩm (Quyết định số 2119/QĐ</w:t>
+            </w:r>
+            <w:r>
+              <w:rPr>
+                <w:color w:val="000000"/>
+              </w:rPr>
               <w:noBreakHyphen/>
-              <w:t xml:space="preserve">CĐKT)</w:t>
-            </w:r>
-          </w:p>
-          <w:p>
-            <w:pPr>
-              <w:rPr>
-                <w:color w:val="000000"/>
-                <w:sz w:val="24"/>
-                <w:szCs w:val="24"/>
-              </w:rPr>
-              <w:jc w:val="left"/>
-              <w:spacing w:before="40" w:after="40" w:line="240" w:lineRule="auto"/>
-            </w:pPr>
-            <w:r>
-              <w:rPr>
-                <w:color w:val="000000"/>
-                <w:sz w:val="24"/>
-                <w:szCs w:val="24"/>
-                <w:b w:val="0"/>
-              </w:rPr>
-              <w:t xml:space="preserve">c) Hệ số sản phẩm nhân hệ số mức độ công việc</w:t>
-            </w:r>
-          </w:p>
-          <w:p>
-            <w:pPr>
-              <w:rPr>
-                <w:color w:val="000000"/>
-                <w:sz w:val="24"/>
-                <w:szCs w:val="24"/>
-              </w:rPr>
-              <w:jc w:val="left"/>
-              <w:spacing w:before="40" w:after="40" w:line="240" w:lineRule="auto"/>
-            </w:pPr>
-            <w:r>
-              <w:rPr>
-                <w:color w:val="000000"/>
-                <w:sz w:val="24"/>
-                <w:szCs w:val="24"/>
-                <w:b w:val="0"/>
-              </w:rPr>
-              <w:t xml:space="preserve">d) Phương án khác</w:t>
+              <w:t>CĐKT)</w:t>
+            </w:r>
+          </w:p>
+          <w:p>
+            <w:pPr>
+              <w:spacing w:before="40" w:after="40"/>
+              <w:rPr>
+                <w:color w:val="000000"/>
+              </w:rPr>
+            </w:pPr>
+            <w:r>
+              <w:rPr>
+                <w:color w:val="000000"/>
+              </w:rPr>
+              <w:t>c) Hệ số sản phẩm nhân hệ số mức độ công việc</w:t>
+            </w:r>
+          </w:p>
+          <w:p>
+            <w:pPr>
+              <w:spacing w:before="40" w:after="40"/>
+              <w:rPr>
+                <w:color w:val="000000"/>
+              </w:rPr>
+            </w:pPr>
+            <w:r>
+              <w:rPr>
+                <w:color w:val="000000"/>
+              </w:rPr>
+              <w:t>d) Phương án khác</w:t>
             </w:r>
           </w:p>
         </w:tc>
@@ -1075,29 +1122,39 @@
           </w:tcPr>
           <w:p>
             <w:pPr>
-              <w:rPr>
-                <w:color w:val="000000"/>
-                <w:sz w:val="24"/>
-                <w:szCs w:val="24"/>
-              </w:rPr>
-              <w:jc w:val="left"/>
-              <w:spacing w:before="40" w:after="40" w:line="240" w:lineRule="auto"/>
-            </w:pPr>
-            <w:r>
-              <w:rPr>
-                <w:color w:val="000000"/>
-                <w:sz w:val="24"/>
-                <w:szCs w:val="24"/>
-                <w:b w:val="0"/>
-              </w:rPr>
-            </w:r>
+              <w:spacing w:before="40" w:after="40"/>
+              <w:rPr>
+                <w:color w:val="000000"/>
+              </w:rPr>
+            </w:pPr>
+            <w:r>
+              <w:rPr>
+                <w:color w:val="000000"/>
+              </w:rPr>
+              <w:t>b) Chỉ theo hệ số sản phẩm (Quyết định số 2119/QĐ</w:t>
+            </w:r>
+            <w:r>
+              <w:rPr>
+                <w:color w:val="000000"/>
+              </w:rPr>
+              <w:noBreakHyphen/>
+              <w:t>CĐKT)</w:t>
+            </w:r>
+          </w:p>
+          <w:p>
+            <w:pPr>
+              <w:spacing w:before="40" w:after="40"/>
+              <w:rPr>
+                <w:color w:val="000000"/>
+              </w:rPr>
+            </w:pPr>
           </w:p>
         </w:tc>
       </w:tr>
       <w:tr>
         <w:trPr>
+          <w:cantSplit/>
           <w:jc w:val="center"/>
-          <w:cantSplit/>
         </w:trPr>
         <w:tc>
           <w:tcPr>
@@ -1114,22 +1171,17 @@
           </w:tcPr>
           <w:p>
             <w:pPr>
-              <w:rPr>
-                <w:color w:val="000000"/>
-                <w:sz w:val="24"/>
-                <w:szCs w:val="24"/>
-              </w:rPr>
+              <w:spacing w:before="40" w:after="40"/>
               <w:jc w:val="center"/>
-              <w:spacing w:before="40" w:after="40" w:line="240" w:lineRule="auto"/>
-            </w:pPr>
-            <w:r>
-              <w:rPr>
-                <w:color w:val="000000"/>
-                <w:sz w:val="24"/>
-                <w:szCs w:val="24"/>
-                <w:b w:val="0"/>
-              </w:rPr>
-              <w:t xml:space="preserve">2</w:t>
+              <w:rPr>
+                <w:color w:val="000000"/>
+              </w:rPr>
+            </w:pPr>
+            <w:r>
+              <w:rPr>
+                <w:color w:val="000000"/>
+              </w:rPr>
+              <w:t>2</w:t>
             </w:r>
           </w:p>
         </w:tc>
@@ -1148,22 +1200,16 @@
           </w:tcPr>
           <w:p>
             <w:pPr>
-              <w:rPr>
-                <w:color w:val="000000"/>
-                <w:sz w:val="24"/>
-                <w:szCs w:val="24"/>
-              </w:rPr>
-              <w:jc w:val="left"/>
-              <w:spacing w:before="40" w:after="40" w:line="240" w:lineRule="auto"/>
-            </w:pPr>
-            <w:r>
-              <w:rPr>
-                <w:color w:val="000000"/>
-                <w:sz w:val="24"/>
-                <w:szCs w:val="24"/>
-                <w:b w:val="0"/>
-              </w:rPr>
-              <w:t xml:space="preserve">Thời điểm áp dụng phương án tại nội dung 1</w:t>
+              <w:spacing w:before="40" w:after="40"/>
+              <w:rPr>
+                <w:color w:val="000000"/>
+              </w:rPr>
+            </w:pPr>
+            <w:r>
+              <w:rPr>
+                <w:color w:val="000000"/>
+              </w:rPr>
+              <w:t>Thời điểm áp dụng phương án tại nội dung 1</w:t>
             </w:r>
           </w:p>
         </w:tc>
@@ -1182,62 +1228,44 @@
           </w:tcPr>
           <w:p>
             <w:pPr>
-              <w:rPr>
-                <w:color w:val="000000"/>
-                <w:sz w:val="24"/>
-                <w:szCs w:val="24"/>
-              </w:rPr>
-              <w:jc w:val="left"/>
-              <w:spacing w:before="40" w:after="40" w:line="240" w:lineRule="auto"/>
-            </w:pPr>
-            <w:r>
-              <w:rPr>
-                <w:color w:val="000000"/>
-                <w:sz w:val="24"/>
-                <w:szCs w:val="24"/>
-                <w:b w:val="0"/>
-              </w:rPr>
-              <w:t xml:space="preserve">a) Từ Quý IV/2026</w:t>
-            </w:r>
-          </w:p>
-          <w:p>
-            <w:pPr>
-              <w:rPr>
-                <w:color w:val="000000"/>
-                <w:sz w:val="24"/>
-                <w:szCs w:val="24"/>
-              </w:rPr>
-              <w:jc w:val="left"/>
-              <w:spacing w:before="40" w:after="40" w:line="240" w:lineRule="auto"/>
-            </w:pPr>
-            <w:r>
-              <w:rPr>
-                <w:color w:val="000000"/>
-                <w:sz w:val="24"/>
-                <w:szCs w:val="24"/>
-                <w:b w:val="0"/>
-              </w:rPr>
-              <w:t xml:space="preserve">b) Từ năm 2027</w:t>
-            </w:r>
-          </w:p>
-          <w:p>
-            <w:pPr>
-              <w:rPr>
-                <w:color w:val="000000"/>
-                <w:sz w:val="24"/>
-                <w:szCs w:val="24"/>
-              </w:rPr>
-              <w:jc w:val="left"/>
-              <w:spacing w:before="40" w:after="40" w:line="240" w:lineRule="auto"/>
-            </w:pPr>
-            <w:r>
-              <w:rPr>
-                <w:color w:val="000000"/>
-                <w:sz w:val="24"/>
-                <w:szCs w:val="24"/>
-                <w:b w:val="0"/>
-              </w:rPr>
-              <w:t xml:space="preserve">c) Thời điểm khác</w:t>
+              <w:spacing w:before="40" w:after="40"/>
+              <w:rPr>
+                <w:color w:val="000000"/>
+              </w:rPr>
+            </w:pPr>
+            <w:r>
+              <w:rPr>
+                <w:color w:val="000000"/>
+              </w:rPr>
+              <w:t>a) Từ Quý IV/2026</w:t>
+            </w:r>
+          </w:p>
+          <w:p>
+            <w:pPr>
+              <w:spacing w:before="40" w:after="40"/>
+              <w:rPr>
+                <w:color w:val="000000"/>
+              </w:rPr>
+            </w:pPr>
+            <w:r>
+              <w:rPr>
+                <w:color w:val="000000"/>
+              </w:rPr>
+              <w:t>b) Từ năm 2027</w:t>
+            </w:r>
+          </w:p>
+          <w:p>
+            <w:pPr>
+              <w:spacing w:before="40" w:after="40"/>
+              <w:rPr>
+                <w:color w:val="000000"/>
+              </w:rPr>
+            </w:pPr>
+            <w:r>
+              <w:rPr>
+                <w:color w:val="000000"/>
+              </w:rPr>
+              <w:t>c) Thời điểm khác</w:t>
             </w:r>
           </w:p>
         </w:tc>
@@ -1256,29 +1284,32 @@
           </w:tcPr>
           <w:p>
             <w:pPr>
-              <w:rPr>
-                <w:color w:val="000000"/>
-                <w:sz w:val="24"/>
-                <w:szCs w:val="24"/>
-              </w:rPr>
-              <w:jc w:val="left"/>
-              <w:spacing w:before="40" w:after="40" w:line="240" w:lineRule="auto"/>
-            </w:pPr>
-            <w:r>
-              <w:rPr>
-                <w:color w:val="000000"/>
-                <w:sz w:val="24"/>
-                <w:szCs w:val="24"/>
-                <w:b w:val="0"/>
-              </w:rPr>
-            </w:r>
+              <w:spacing w:before="40" w:after="40"/>
+              <w:rPr>
+                <w:color w:val="000000"/>
+              </w:rPr>
+            </w:pPr>
+            <w:r>
+              <w:rPr>
+                <w:color w:val="000000"/>
+              </w:rPr>
+              <w:t>a) Từ Quý IV/2026</w:t>
+            </w:r>
+          </w:p>
+          <w:p>
+            <w:pPr>
+              <w:spacing w:before="40" w:after="40"/>
+              <w:rPr>
+                <w:color w:val="000000"/>
+              </w:rPr>
+            </w:pPr>
           </w:p>
         </w:tc>
       </w:tr>
       <w:tr>
         <w:trPr>
+          <w:cantSplit/>
           <w:jc w:val="center"/>
-          <w:cantSplit/>
         </w:trPr>
         <w:tc>
           <w:tcPr>
@@ -1295,22 +1326,17 @@
           </w:tcPr>
           <w:p>
             <w:pPr>
-              <w:rPr>
-                <w:color w:val="000000"/>
-                <w:sz w:val="24"/>
-                <w:szCs w:val="24"/>
-              </w:rPr>
+              <w:spacing w:before="40" w:after="40"/>
               <w:jc w:val="center"/>
-              <w:spacing w:before="40" w:after="40" w:line="240" w:lineRule="auto"/>
-            </w:pPr>
-            <w:r>
-              <w:rPr>
-                <w:color w:val="000000"/>
-                <w:sz w:val="24"/>
-                <w:szCs w:val="24"/>
-                <w:b w:val="0"/>
-              </w:rPr>
-              <w:t xml:space="preserve">3</w:t>
+              <w:rPr>
+                <w:color w:val="000000"/>
+              </w:rPr>
+            </w:pPr>
+            <w:r>
+              <w:rPr>
+                <w:color w:val="000000"/>
+              </w:rPr>
+              <w:t>3</w:t>
             </w:r>
           </w:p>
         </w:tc>
@@ -1329,24 +1355,23 @@
           </w:tcPr>
           <w:p>
             <w:pPr>
-              <w:rPr>
-                <w:color w:val="000000"/>
-                <w:sz w:val="24"/>
-                <w:szCs w:val="24"/>
-              </w:rPr>
-              <w:jc w:val="left"/>
-              <w:spacing w:before="40" w:after="40" w:line="240" w:lineRule="auto"/>
-            </w:pPr>
-            <w:r>
-              <w:rPr>
-                <w:color w:val="000000"/>
-                <w:sz w:val="24"/>
-                <w:szCs w:val="24"/>
-                <w:b w:val="0"/>
-              </w:rPr>
-              <w:t xml:space="preserve">Cột “Điểm chấm công việc”, “Hệ số quy đổi” trong mẫu Phụ lục I, Phụ lục II kèm theo Quyết định số 1923/QĐ</w:t>
+              <w:spacing w:before="40" w:after="40"/>
+              <w:rPr>
+                <w:color w:val="000000"/>
+              </w:rPr>
+            </w:pPr>
+            <w:r>
+              <w:rPr>
+                <w:color w:val="000000"/>
+              </w:rPr>
+              <w:t>Cột “Điểm chấm công việc”, “Hệ số quy đổi” trong mẫu Phụ lục I, Phụ lục II kèm theo Quyết định số 1923/QĐ</w:t>
+            </w:r>
+            <w:r>
+              <w:rPr>
+                <w:color w:val="000000"/>
+              </w:rPr>
               <w:noBreakHyphen/>
-              <w:t xml:space="preserve">CĐKT</w:t>
+              <w:t>CĐKT</w:t>
             </w:r>
           </w:p>
         </w:tc>
@@ -1365,64 +1390,51 @@
           </w:tcPr>
           <w:p>
             <w:pPr>
-              <w:rPr>
-                <w:color w:val="000000"/>
-                <w:sz w:val="24"/>
-                <w:szCs w:val="24"/>
-              </w:rPr>
-              <w:jc w:val="left"/>
-              <w:spacing w:before="40" w:after="40" w:line="240" w:lineRule="auto"/>
-            </w:pPr>
-            <w:r>
-              <w:rPr>
-                <w:color w:val="000000"/>
-                <w:sz w:val="24"/>
-                <w:szCs w:val="24"/>
-                <w:b w:val="0"/>
-              </w:rPr>
-              <w:t xml:space="preserve">a) Giữ nguyên thang 04 mức độ công việc</w:t>
-            </w:r>
-          </w:p>
-          <w:p>
-            <w:pPr>
-              <w:rPr>
-                <w:color w:val="000000"/>
-                <w:sz w:val="24"/>
-                <w:szCs w:val="24"/>
-              </w:rPr>
-              <w:jc w:val="left"/>
-              <w:spacing w:before="40" w:after="40" w:line="240" w:lineRule="auto"/>
-            </w:pPr>
-            <w:r>
-              <w:rPr>
-                <w:color w:val="000000"/>
-                <w:sz w:val="24"/>
-                <w:szCs w:val="24"/>
-                <w:b w:val="0"/>
-              </w:rPr>
-              <w:t xml:space="preserve">b) Chuyển sang hệ số theo Danh mục kèm theo Quyết định số 2119/QĐ</w:t>
+              <w:spacing w:before="40" w:after="40"/>
+              <w:rPr>
+                <w:color w:val="000000"/>
+              </w:rPr>
+            </w:pPr>
+            <w:r>
+              <w:rPr>
+                <w:color w:val="000000"/>
+              </w:rPr>
+              <w:t>a) Giữ nguyên thang 04 mức độ công việc</w:t>
+            </w:r>
+          </w:p>
+          <w:p>
+            <w:pPr>
+              <w:spacing w:before="40" w:after="40"/>
+              <w:rPr>
+                <w:color w:val="000000"/>
+              </w:rPr>
+            </w:pPr>
+            <w:r>
+              <w:rPr>
+                <w:color w:val="000000"/>
+              </w:rPr>
+              <w:t>b) Chuyển sang hệ số theo Danh mục kèm theo Quyết định số 2119/QĐ</w:t>
+            </w:r>
+            <w:r>
+              <w:rPr>
+                <w:color w:val="000000"/>
+              </w:rPr>
               <w:noBreakHyphen/>
-              <w:t xml:space="preserve">CĐKT</w:t>
-            </w:r>
-          </w:p>
-          <w:p>
-            <w:pPr>
-              <w:rPr>
-                <w:color w:val="000000"/>
-                <w:sz w:val="24"/>
-                <w:szCs w:val="24"/>
-              </w:rPr>
-              <w:jc w:val="left"/>
-              <w:spacing w:before="40" w:after="40" w:line="240" w:lineRule="auto"/>
-            </w:pPr>
-            <w:r>
-              <w:rPr>
-                <w:color w:val="000000"/>
-                <w:sz w:val="24"/>
-                <w:szCs w:val="24"/>
-                <w:b w:val="0"/>
-              </w:rPr>
-              <w:t xml:space="preserve">c) Điều chỉnh mẫu theo hướng dẫn của phòng TCCB&amp;CTHSSV</w:t>
+              <w:t>CĐKT</w:t>
+            </w:r>
+          </w:p>
+          <w:p>
+            <w:pPr>
+              <w:spacing w:before="40" w:after="40"/>
+              <w:rPr>
+                <w:color w:val="000000"/>
+              </w:rPr>
+            </w:pPr>
+            <w:r>
+              <w:rPr>
+                <w:color w:val="000000"/>
+              </w:rPr>
+              <w:t>c) Điều chỉnh mẫu theo hướng dẫn của phòng TCCB&amp;CTHSSV</w:t>
             </w:r>
           </w:p>
         </w:tc>
@@ -1441,29 +1453,32 @@
           </w:tcPr>
           <w:p>
             <w:pPr>
-              <w:rPr>
-                <w:color w:val="000000"/>
-                <w:sz w:val="24"/>
-                <w:szCs w:val="24"/>
-              </w:rPr>
-              <w:jc w:val="left"/>
-              <w:spacing w:before="40" w:after="40" w:line="240" w:lineRule="auto"/>
-            </w:pPr>
-            <w:r>
-              <w:rPr>
-                <w:color w:val="000000"/>
-                <w:sz w:val="24"/>
-                <w:szCs w:val="24"/>
-                <w:b w:val="0"/>
-              </w:rPr>
-            </w:r>
+              <w:spacing w:before="40" w:after="40"/>
+              <w:rPr>
+                <w:color w:val="000000"/>
+              </w:rPr>
+            </w:pPr>
+            <w:r>
+              <w:rPr>
+                <w:color w:val="000000"/>
+              </w:rPr>
+              <w:t>a) Giữ nguyên thang 04 mức độ công việc</w:t>
+            </w:r>
+          </w:p>
+          <w:p>
+            <w:pPr>
+              <w:spacing w:before="40" w:after="40"/>
+              <w:rPr>
+                <w:color w:val="000000"/>
+              </w:rPr>
+            </w:pPr>
           </w:p>
         </w:tc>
       </w:tr>
       <w:tr>
         <w:trPr>
+          <w:cantSplit/>
           <w:jc w:val="center"/>
-          <w:cantSplit/>
         </w:trPr>
         <w:tc>
           <w:tcPr>
@@ -1480,22 +1495,17 @@
           </w:tcPr>
           <w:p>
             <w:pPr>
-              <w:rPr>
-                <w:color w:val="000000"/>
-                <w:sz w:val="24"/>
-                <w:szCs w:val="24"/>
-              </w:rPr>
+              <w:spacing w:before="40" w:after="40"/>
               <w:jc w:val="center"/>
-              <w:spacing w:before="40" w:after="40" w:line="240" w:lineRule="auto"/>
-            </w:pPr>
-            <w:r>
-              <w:rPr>
-                <w:color w:val="000000"/>
-                <w:sz w:val="24"/>
-                <w:szCs w:val="24"/>
-                <w:b w:val="0"/>
-              </w:rPr>
-              <w:t xml:space="preserve">4</w:t>
+              <w:rPr>
+                <w:color w:val="000000"/>
+              </w:rPr>
+            </w:pPr>
+            <w:r>
+              <w:rPr>
+                <w:color w:val="000000"/>
+              </w:rPr>
+              <w:t>4</w:t>
             </w:r>
           </w:p>
         </w:tc>
@@ -1514,24 +1524,23 @@
           </w:tcPr>
           <w:p>
             <w:pPr>
-              <w:rPr>
-                <w:color w:val="000000"/>
-                <w:sz w:val="24"/>
-                <w:szCs w:val="24"/>
-              </w:rPr>
-              <w:jc w:val="left"/>
-              <w:spacing w:before="40" w:after="40" w:line="240" w:lineRule="auto"/>
-            </w:pPr>
-            <w:r>
-              <w:rPr>
-                <w:color w:val="000000"/>
-                <w:sz w:val="24"/>
-                <w:szCs w:val="24"/>
-                <w:b w:val="0"/>
-              </w:rPr>
-              <w:t xml:space="preserve">Cách xác định trọng số từng chỉ tiêu khi lập Bản cam kết KPI (tổng bằng 100% theo Điều 3 Quyết định số 2164/QĐ</w:t>
+              <w:spacing w:before="40" w:after="40"/>
+              <w:rPr>
+                <w:color w:val="000000"/>
+              </w:rPr>
+            </w:pPr>
+            <w:r>
+              <w:rPr>
+                <w:color w:val="000000"/>
+              </w:rPr>
+              <w:t>Cách xác định trọng số từng chỉ tiêu khi lập Bản cam kết KPI (tổng bằng 100% theo Điều 3 Quyết định số 2164/QĐ</w:t>
+            </w:r>
+            <w:r>
+              <w:rPr>
+                <w:color w:val="000000"/>
+              </w:rPr>
               <w:noBreakHyphen/>
-              <w:t xml:space="preserve">CĐKT)</w:t>
+              <w:t>CĐKT)</w:t>
             </w:r>
           </w:p>
         </w:tc>
@@ -1550,62 +1559,44 @@
           </w:tcPr>
           <w:p>
             <w:pPr>
-              <w:rPr>
-                <w:color w:val="000000"/>
-                <w:sz w:val="24"/>
-                <w:szCs w:val="24"/>
-              </w:rPr>
-              <w:jc w:val="left"/>
-              <w:spacing w:before="40" w:after="40" w:line="240" w:lineRule="auto"/>
-            </w:pPr>
-            <w:r>
-              <w:rPr>
-                <w:color w:val="000000"/>
-                <w:sz w:val="24"/>
-                <w:szCs w:val="24"/>
-                <w:b w:val="0"/>
-              </w:rPr>
-              <w:t xml:space="preserve">a) Theo điểm tối đa từng Trục của mẫu kế hoạch, KPI hằng quý</w:t>
-            </w:r>
-          </w:p>
-          <w:p>
-            <w:pPr>
-              <w:rPr>
-                <w:color w:val="000000"/>
-                <w:sz w:val="24"/>
-                <w:szCs w:val="24"/>
-              </w:rPr>
-              <w:jc w:val="left"/>
-              <w:spacing w:before="40" w:after="40" w:line="240" w:lineRule="auto"/>
-            </w:pPr>
-            <w:r>
-              <w:rPr>
-                <w:color w:val="000000"/>
-                <w:sz w:val="24"/>
-                <w:szCs w:val="24"/>
-                <w:b w:val="0"/>
-              </w:rPr>
-              <w:t xml:space="preserve">b) Theo tỷ lệ khối lượng quy đổi của từng chỉ tiêu</w:t>
-            </w:r>
-          </w:p>
-          <w:p>
-            <w:pPr>
-              <w:rPr>
-                <w:color w:val="000000"/>
-                <w:sz w:val="24"/>
-                <w:szCs w:val="24"/>
-              </w:rPr>
-              <w:jc w:val="left"/>
-              <w:spacing w:before="40" w:after="40" w:line="240" w:lineRule="auto"/>
-            </w:pPr>
-            <w:r>
-              <w:rPr>
-                <w:color w:val="000000"/>
-                <w:sz w:val="24"/>
-                <w:szCs w:val="24"/>
-                <w:b w:val="0"/>
-              </w:rPr>
-              <w:t xml:space="preserve">c) Trưởng đơn vị và cá nhân thống nhất khi ký Bản cam kết</w:t>
+              <w:spacing w:before="40" w:after="40"/>
+              <w:rPr>
+                <w:color w:val="000000"/>
+              </w:rPr>
+            </w:pPr>
+            <w:r>
+              <w:rPr>
+                <w:color w:val="000000"/>
+              </w:rPr>
+              <w:t>a) Theo điểm tối đa từng Trục của mẫu kế hoạch, KPI hằng quý</w:t>
+            </w:r>
+          </w:p>
+          <w:p>
+            <w:pPr>
+              <w:spacing w:before="40" w:after="40"/>
+              <w:rPr>
+                <w:color w:val="000000"/>
+              </w:rPr>
+            </w:pPr>
+            <w:r>
+              <w:rPr>
+                <w:color w:val="000000"/>
+              </w:rPr>
+              <w:t>b) Theo tỷ lệ khối lượng quy đổi của từng chỉ tiêu</w:t>
+            </w:r>
+          </w:p>
+          <w:p>
+            <w:pPr>
+              <w:spacing w:before="40" w:after="40"/>
+              <w:rPr>
+                <w:color w:val="000000"/>
+              </w:rPr>
+            </w:pPr>
+            <w:r>
+              <w:rPr>
+                <w:color w:val="000000"/>
+              </w:rPr>
+              <w:t>c) Trưởng đơn vị và cá nhân thống nhất khi ký Bản cam kết</w:t>
             </w:r>
           </w:p>
         </w:tc>
@@ -1624,21 +1615,16 @@
           </w:tcPr>
           <w:p>
             <w:pPr>
-              <w:rPr>
-                <w:color w:val="000000"/>
-                <w:sz w:val="24"/>
-                <w:szCs w:val="24"/>
-              </w:rPr>
-              <w:jc w:val="left"/>
-              <w:spacing w:before="40" w:after="40" w:line="240" w:lineRule="auto"/>
-            </w:pPr>
-            <w:r>
-              <w:rPr>
-                <w:color w:val="000000"/>
-                <w:sz w:val="24"/>
-                <w:szCs w:val="24"/>
-                <w:b w:val="0"/>
-              </w:rPr>
+              <w:spacing w:before="40" w:after="40"/>
+              <w:rPr>
+                <w:color w:val="000000"/>
+              </w:rPr>
+            </w:pPr>
+            <w:r>
+              <w:rPr>
+                <w:color w:val="000000"/>
+              </w:rPr>
+              <w:t>Cả 3</w:t>
             </w:r>
           </w:p>
         </w:tc>
@@ -1668,9 +1654,9 @@
       </w:pPr>
       <w:r>
         <w:rPr>
-          <w:sz w:val="28"/>
-          <w:szCs w:val="28"/>
           <w:b/>
+          <w:sz w:val="28"/>
+          <w:szCs w:val="28"/>
         </w:rPr>
         <w:t xml:space="preserve">4. Thời hạn: </w:t>
       </w:r>
@@ -1678,11 +1664,16 @@
         <w:rPr>
           <w:sz w:val="28"/>
           <w:szCs w:val="28"/>
-          <w:b w:val="0"/>
-        </w:rPr>
-        <w:t xml:space="preserve">Đề nghị phòng TCCB&amp;CTHSSV cho ý kiến trước ngày 13/10/2026 để phòng TH</w:t>
+        </w:rPr>
+        <w:t>Đề nghị phòng TCCB&amp;CTHSSV cho ý kiến trước ngày 13/10/2026 để phòng TH</w:t>
+      </w:r>
+      <w:r>
+        <w:rPr>
+          <w:sz w:val="28"/>
+          <w:szCs w:val="28"/>
+        </w:rPr>
         <w:noBreakHyphen/>
-        <w:t xml:space="preserve">HC&amp;QT hướng dẫn các đơn vị tham gia thí điểm và cập nhật Bộ công cụ sau thời gian thí điểm.</w:t>
+        <w:t>HC&amp;QT hướng dẫn các đơn vị tham gia thí điểm và cập nhật Bộ công cụ sau thời gian thí điểm.</w:t>
       </w:r>
     </w:p>
     <w:p>
@@ -1705,9 +1696,16 @@
           <w:szCs w:val="28"/>
           <w:shd w:val="clear" w:color="auto" w:fill="FFFFFF"/>
         </w:rPr>
-        <w:t xml:space="preserve">Phòng TH</w:t>
+        <w:t>Phòng TH</w:t>
+      </w:r>
+      <w:r>
+        <w:rPr>
+          <w:sz w:val="28"/>
+          <w:szCs w:val="28"/>
+          <w:shd w:val="clear" w:color="auto" w:fill="FFFFFF"/>
+        </w:rPr>
         <w:noBreakHyphen/>
-        <w:t xml:space="preserve">HC&amp;QT kính đề nghị phòng TCCB&amp;CTHSSV quan tâm, cho ý kiến./.</w:t>
+        <w:t>HC&amp;QT kính đề nghị phòng TCCB&amp;CTHSSV quan tâm, cho ý kiến./.</w:t>
       </w:r>
     </w:p>
     <w:tbl>
@@ -1754,7 +1752,7 @@
                 <w:szCs w:val="28"/>
                 <w:lang w:val="nl-NL"/>
               </w:rPr>
-              <w:t xml:space="preserve">Ý KIẾN CỦA LÃNH ĐẠO ĐƠN VỊ XIN Ý KIẾN</w:t>
+              <w:t>Ý KIẾN CỦA LÃNH ĐẠO ĐƠN VỊ XIN Ý KIẾN</w:t>
             </w:r>
           </w:p>
           <w:p>
@@ -1777,7 +1775,7 @@
                 <w:szCs w:val="28"/>
                 <w:lang w:val="nl-NL"/>
               </w:rPr>
-              <w:t xml:space="preserve">Kính gửi phòng TCCB&amp;CTHSSV cho ý kiến.</w:t>
+              <w:t>Kính gửi phòng TCCB&amp;CTHSSV cho ý kiến.</w:t>
             </w:r>
           </w:p>
           <w:p>
@@ -1822,7 +1820,25 @@
                 <w:szCs w:val="28"/>
                 <w:lang w:val="nl-NL"/>
               </w:rPr>
-              <w:t xml:space="preserve">Ngày      /10/2026</w:t>
+              <w:t>Ngày</w:t>
+            </w:r>
+            <w:r>
+              <w:rPr>
+                <w:i/>
+                <w:sz w:val="28"/>
+                <w:szCs w:val="28"/>
+                <w:lang w:val="nl-NL"/>
+              </w:rPr>
+              <w:t xml:space="preserve"> 05</w:t>
+            </w:r>
+            <w:r>
+              <w:rPr>
+                <w:i/>
+                <w:sz w:val="28"/>
+                <w:szCs w:val="28"/>
+                <w:lang w:val="nl-NL"/>
+              </w:rPr>
+              <w:t>/10/2026</w:t>
             </w:r>
           </w:p>
           <w:p>
@@ -1844,6 +1860,24 @@
                 <w:szCs w:val="28"/>
               </w:rPr>
             </w:pPr>
+          </w:p>
+          <w:p>
+            <w:pPr>
+              <w:jc w:val="center"/>
+              <w:rPr>
+                <w:i/>
+                <w:sz w:val="28"/>
+                <w:szCs w:val="28"/>
+              </w:rPr>
+            </w:pPr>
+            <w:r>
+              <w:rPr>
+                <w:i/>
+                <w:sz w:val="28"/>
+                <w:szCs w:val="28"/>
+              </w:rPr>
+              <w:t>Đã ký</w:t>
+            </w:r>
           </w:p>
           <w:p>
             <w:pPr>
@@ -1932,8 +1966,7 @@
                 <w:szCs w:val="28"/>
                 <w:lang w:val="nl-NL"/>
               </w:rPr>
-              <w:lastRenderedPageBreak/>
-              <w:t xml:space="preserve">Ý KIẾN CỦA PHÒNG TCCB&amp;CTHSSV</w:t>
+              <w:t>Ý KIẾN CỦA PHÒNG TCCB&amp;CTHSSV</w:t>
             </w:r>
           </w:p>
           <w:p>
@@ -1969,78 +2002,104 @@
                 <w:szCs w:val="28"/>
                 <w:lang w:val="nl-NL"/>
               </w:rPr>
-              <w:t xml:space="preserve">Ngày      /10/2026</w:t>
-            </w:r>
-          </w:p>
-          <w:p>
-            <w:pPr>
-              <w:jc w:val="center"/>
-              <w:rPr>
-                <w:i/>
-                <w:sz w:val="22"/>
-                <w:szCs w:val="22"/>
-              </w:rPr>
-            </w:pPr>
-          </w:p>
-          <w:p>
-            <w:pPr>
-              <w:jc w:val="center"/>
-              <w:rPr>
-                <w:i/>
-                <w:sz w:val="28"/>
-                <w:szCs w:val="28"/>
-              </w:rPr>
-            </w:pPr>
-          </w:p>
-          <w:p>
-            <w:pPr>
-              <w:jc w:val="center"/>
-              <w:rPr>
-                <w:i/>
-                <w:sz w:val="28"/>
-                <w:szCs w:val="28"/>
-              </w:rPr>
-            </w:pPr>
-          </w:p>
-          <w:p>
-            <w:pPr>
-              <w:jc w:val="center"/>
-              <w:rPr>
-                <w:i/>
-                <w:sz w:val="28"/>
-                <w:szCs w:val="28"/>
-              </w:rPr>
-            </w:pPr>
-          </w:p>
-          <w:p>
-            <w:pPr>
-              <w:jc w:val="center"/>
-              <w:rPr>
-                <w:i/>
-                <w:sz w:val="28"/>
-                <w:szCs w:val="28"/>
-              </w:rPr>
-            </w:pPr>
-          </w:p>
-          <w:p>
-            <w:pPr>
-              <w:jc w:val="center"/>
-              <w:rPr>
-                <w:i/>
-                <w:sz w:val="28"/>
-                <w:szCs w:val="28"/>
-              </w:rPr>
-            </w:pPr>
-          </w:p>
-          <w:p>
-            <w:pPr>
-              <w:jc w:val="center"/>
+              <w:t xml:space="preserve">Ngày </w:t>
+            </w:r>
+            <w:r>
               <w:rPr>
                 <w:i/>
                 <w:sz w:val="28"/>
                 <w:szCs w:val="28"/>
                 <w:lang w:val="nl-NL"/>
               </w:rPr>
+              <w:t>06</w:t>
+            </w:r>
+            <w:r>
+              <w:rPr>
+                <w:i/>
+                <w:sz w:val="28"/>
+                <w:szCs w:val="28"/>
+                <w:lang w:val="nl-NL"/>
+              </w:rPr>
+              <w:t>/10/2026</w:t>
+            </w:r>
+          </w:p>
+          <w:p>
+            <w:pPr>
+              <w:jc w:val="center"/>
+              <w:rPr>
+                <w:i/>
+                <w:sz w:val="22"/>
+                <w:szCs w:val="22"/>
+              </w:rPr>
+            </w:pPr>
+          </w:p>
+          <w:p>
+            <w:pPr>
+              <w:jc w:val="center"/>
+              <w:rPr>
+                <w:i/>
+                <w:sz w:val="28"/>
+                <w:szCs w:val="28"/>
+              </w:rPr>
+            </w:pPr>
+          </w:p>
+          <w:p>
+            <w:pPr>
+              <w:jc w:val="center"/>
+              <w:rPr>
+                <w:i/>
+                <w:sz w:val="28"/>
+                <w:szCs w:val="28"/>
+              </w:rPr>
+            </w:pPr>
+          </w:p>
+          <w:p>
+            <w:pPr>
+              <w:jc w:val="center"/>
+              <w:rPr>
+                <w:i/>
+                <w:sz w:val="28"/>
+                <w:szCs w:val="28"/>
+              </w:rPr>
+            </w:pPr>
+            <w:r>
+              <w:rPr>
+                <w:i/>
+                <w:sz w:val="28"/>
+                <w:szCs w:val="28"/>
+              </w:rPr>
+              <w:t>Đã ký</w:t>
+            </w:r>
+          </w:p>
+          <w:p>
+            <w:pPr>
+              <w:jc w:val="center"/>
+              <w:rPr>
+                <w:i/>
+                <w:sz w:val="28"/>
+                <w:szCs w:val="28"/>
+              </w:rPr>
+            </w:pPr>
+          </w:p>
+          <w:p>
+            <w:pPr>
+              <w:jc w:val="center"/>
+              <w:rPr>
+                <w:i/>
+                <w:sz w:val="28"/>
+                <w:szCs w:val="28"/>
+              </w:rPr>
+            </w:pPr>
+          </w:p>
+          <w:p>
+            <w:pPr>
+              <w:jc w:val="center"/>
+              <w:rPr>
+                <w:i/>
+                <w:sz w:val="28"/>
+                <w:szCs w:val="28"/>
+                <w:lang w:val="nl-NL"/>
+              </w:rPr>
             </w:pPr>
             <w:r>
               <w:rPr>
@@ -2049,7 +2108,7 @@
                 <w:sz w:val="28"/>
                 <w:szCs w:val="28"/>
               </w:rPr>
-              <w:t xml:space="preserve">…………………………</w:t>
+              <w:t>Nguyễn Thị Lành</w:t>
             </w:r>
           </w:p>
         </w:tc>
@@ -2083,7 +2142,7 @@
 </file>
 
 <file path=word/endnotes.xml><?xml version="1.0" encoding="utf-8"?>
-<w:endnotes xmlns:wpc="http://schemas.microsoft.com/office/word/2010/wordprocessingCanvas" xmlns:cx="http://schemas.microsoft.com/office/drawing/2014/chartex" xmlns:cx1="http://schemas.microsoft.com/office/drawing/2015/9/8/chartex" xmlns:cx2="http://schemas.microsoft.com/office/drawing/2015/10/21/chartex" xmlns:cx3="http://schemas.microsoft.com/office/drawing/2016/5/9/chartex" xmlns:cx4="http://schemas.microsoft.com/office/drawing/2016/5/10/chartex" xmlns:cx5="http://schemas.microsoft.com/office/drawing/2016/5/11/chartex" xmlns:cx6="http://schemas.microsoft.com/office/drawing/2016/5/12/chartex" xmlns:cx7="http://schemas.microsoft.com/office/drawing/2016/5/13/chartex" xmlns:cx8="http://schemas.microsoft.com/office/drawing/2016/5/14/chartex" xmlns:mc="http://schemas.openxmlformats.org/markup-compatibility/2006" xmlns:aink="http://schemas.microsoft.com/office/drawing/2016/ink" xmlns:am3d="http://schemas.microsoft.com/office/drawing/2017/model3d" xmlns:o="urn:schemas-microsoft-com:office:office" xmlns:oel="http://schemas.microsoft.com/office/2019/extlst" xmlns:r="http://schemas.openxmlformats.org/officeDocument/2006/relationships" xmlns:m="http://schemas.openxmlformats.org/officeDocument/2006/math" xmlns:v="urn:schemas-microsoft-com:vml" xmlns:wp14="http://schemas.microsoft.com/office/word/2010/wordprocessingDrawing" xmlns:wp="http://schemas.openxmlformats.org/drawingml/2006/wordprocessingDrawing" xmlns:w10="urn:schemas-microsoft-com:office:word" xmlns:w="http://schemas.openxmlformats.org/wordprocessingml/2006/main" xmlns:w14="http://schemas.microsoft.com/office/word/2010/wordml" xmlns:w15="http://schemas.microsoft.com/office/word/2012/wordml" xmlns:w16cex="http://schemas.microsoft.com/office/word/2018/wordml/cex" xmlns:w16cid="http://schemas.microsoft.com/office/word/2016/wordml/cid" xmlns:w16="http://schemas.microsoft.com/office/word/2018/wordml" xmlns:w16du="http://schemas.microsoft.com/office/word/2023/wordml/word16du" xmlns:w16sdtdh="http://schemas.microsoft.com/office/word/2020/wordml/sdtdatahash" xmlns:w16sdtfl="http://schemas.microsoft.com/office/word/2024/wordml/sdtformatlock" xmlns:w16se="http://schemas.microsoft.com/office/word/2015/wordml/symex" xmlns:wpg="http://schemas.microsoft.com/office/word/2010/wordprocessingGroup" xmlns:wpi="http://schemas.microsoft.com/office/word/2010/wordprocessingInk" xmlns:wne="http://schemas.microsoft.com/office/word/2006/wordml" xmlns:wps="http://schemas.microsoft.com/office/word/2010/wordprocessingShape" mc:Ignorable="w14 w15 w16se w16cid w16 w16cex w16sdtdh w16sdtfl w16du wp14">
+<w:endnotes xmlns:wpc="http://schemas.microsoft.com/office/word/2010/wordprocessingCanvas" xmlns:cx="http://schemas.microsoft.com/office/drawing/2014/chartex" xmlns:cx1="http://schemas.microsoft.com/office/drawing/2015/9/8/chartex" xmlns:cx2="http://schemas.microsoft.com/office/drawing/2015/10/21/chartex" xmlns:cx3="http://schemas.microsoft.com/office/drawing/2016/5/9/chartex" xmlns:cx4="http://schemas.microsoft.com/office/drawing/2016/5/10/chartex" xmlns:cx5="http://schemas.microsoft.com/office/drawing/2016/5/11/chartex" xmlns:cx6="http://schemas.microsoft.com/office/drawing/2016/5/12/chartex" xmlns:cx7="http://schemas.microsoft.com/office/drawing/2016/5/13/chartex" xmlns:cx8="http://schemas.microsoft.com/office/drawing/2016/5/14/chartex" xmlns:mc="http://schemas.openxmlformats.org/markup-compatibility/2006" xmlns:aink="http://schemas.microsoft.com/office/drawing/2016/ink" xmlns:am3d="http://schemas.microsoft.com/office/drawing/2017/model3d" xmlns:o="urn:schemas-microsoft-com:office:office" xmlns:oel="http://schemas.microsoft.com/office/2019/extlst" xmlns:r="http://schemas.openxmlformats.org/officeDocument/2006/relationships" xmlns:m="http://schemas.openxmlformats.org/officeDocument/2006/math" xmlns:v="urn:schemas-microsoft-com:vml" xmlns:wp14="http://schemas.microsoft.com/office/word/2010/wordprocessingDrawing" xmlns:wp="http://schemas.openxmlformats.org/drawingml/2006/wordprocessingDrawing" xmlns:w10="urn:schemas-microsoft-com:office:word" xmlns:w="http://schemas.openxmlformats.org/wordprocessingml/2006/main" xmlns:w14="http://schemas.microsoft.com/office/word/2010/wordml" xmlns:w15="http://schemas.microsoft.com/office/word/2012/wordml" xmlns:w16cex="http://schemas.microsoft.com/office/word/2018/wordml/cex" xmlns:w16cid="http://schemas.microsoft.com/office/word/2016/wordml/cid" xmlns:w16="http://schemas.microsoft.com/office/word/2018/wordml" xmlns:w16du="http://schemas.microsoft.com/office/word/2023/wordml/word16du" xmlns:w16sdtdh="http://schemas.microsoft.com/office/word/2020/wordml/sdtdatahash" xmlns:w16se="http://schemas.microsoft.com/office/word/2015/wordml/symex" xmlns:wpg="http://schemas.microsoft.com/office/word/2010/wordprocessingGroup" xmlns:wpi="http://schemas.microsoft.com/office/word/2010/wordprocessingInk" xmlns:wne="http://schemas.microsoft.com/office/word/2006/wordml" xmlns:wps="http://schemas.microsoft.com/office/word/2010/wordprocessingShape" mc:Ignorable="w14 w15 w16se w16cid w16 w16cex w16sdtdh wp14">
   <w:endnote w:type="separator" w:id="-1">
     <w:p>
       <w:r>
@@ -2102,7 +2161,7 @@
 </file>
 
 <file path=word/footer1.xml><?xml version="1.0" encoding="utf-8"?>
-<w:ftr xmlns:wpc="http://schemas.microsoft.com/office/word/2010/wordprocessingCanvas" xmlns:cx="http://schemas.microsoft.com/office/drawing/2014/chartex" xmlns:cx1="http://schemas.microsoft.com/office/drawing/2015/9/8/chartex" xmlns:cx2="http://schemas.microsoft.com/office/drawing/2015/10/21/chartex" xmlns:cx3="http://schemas.microsoft.com/office/drawing/2016/5/9/chartex" xmlns:cx4="http://schemas.microsoft.com/office/drawing/2016/5/10/chartex" xmlns:cx5="http://schemas.microsoft.com/office/drawing/2016/5/11/chartex" xmlns:cx6="http://schemas.microsoft.com/office/drawing/2016/5/12/chartex" xmlns:cx7="http://schemas.microsoft.com/office/drawing/2016/5/13/chartex" xmlns:cx8="http://schemas.microsoft.com/office/drawing/2016/5/14/chartex" xmlns:mc="http://schemas.openxmlformats.org/markup-compatibility/2006" xmlns:aink="http://schemas.microsoft.com/office/drawing/2016/ink" xmlns:am3d="http://schemas.microsoft.com/office/drawing/2017/model3d" xmlns:o="urn:schemas-microsoft-com:office:office" xmlns:oel="http://schemas.microsoft.com/office/2019/extlst" xmlns:r="http://schemas.openxmlformats.org/officeDocument/2006/relationships" xmlns:m="http://schemas.openxmlformats.org/officeDocument/2006/math" xmlns:v="urn:schemas-microsoft-com:vml" xmlns:wp14="http://schemas.microsoft.com/office/word/2010/wordprocessingDrawing" xmlns:wp="http://schemas.openxmlformats.org/drawingml/2006/wordprocessingDrawing" xmlns:w10="urn:schemas-microsoft-com:office:word" xmlns:w="http://schemas.openxmlformats.org/wordprocessingml/2006/main" xmlns:w14="http://schemas.microsoft.com/office/word/2010/wordml" xmlns:w15="http://schemas.microsoft.com/office/word/2012/wordml" xmlns:w16cex="http://schemas.microsoft.com/office/word/2018/wordml/cex" xmlns:w16cid="http://schemas.microsoft.com/office/word/2016/wordml/cid" xmlns:w16="http://schemas.microsoft.com/office/word/2018/wordml" xmlns:w16du="http://schemas.microsoft.com/office/word/2023/wordml/word16du" xmlns:w16sdtdh="http://schemas.microsoft.com/office/word/2020/wordml/sdtdatahash" xmlns:w16sdtfl="http://schemas.microsoft.com/office/word/2024/wordml/sdtformatlock" xmlns:w16se="http://schemas.microsoft.com/office/word/2015/wordml/symex" xmlns:wpg="http://schemas.microsoft.com/office/word/2010/wordprocessingGroup" xmlns:wpi="http://schemas.microsoft.com/office/word/2010/wordprocessingInk" xmlns:wne="http://schemas.microsoft.com/office/word/2006/wordml" xmlns:wps="http://schemas.microsoft.com/office/word/2010/wordprocessingShape" mc:Ignorable="w14 w15 w16se w16cid w16 w16cex w16sdtdh w16sdtfl w16du wp14">
+<w:ftr xmlns:wpc="http://schemas.microsoft.com/office/word/2010/wordprocessingCanvas" xmlns:cx="http://schemas.microsoft.com/office/drawing/2014/chartex" xmlns:cx1="http://schemas.microsoft.com/office/drawing/2015/9/8/chartex" xmlns:cx2="http://schemas.microsoft.com/office/drawing/2015/10/21/chartex" xmlns:cx3="http://schemas.microsoft.com/office/drawing/2016/5/9/chartex" xmlns:cx4="http://schemas.microsoft.com/office/drawing/2016/5/10/chartex" xmlns:cx5="http://schemas.microsoft.com/office/drawing/2016/5/11/chartex" xmlns:cx6="http://schemas.microsoft.com/office/drawing/2016/5/12/chartex" xmlns:cx7="http://schemas.microsoft.com/office/drawing/2016/5/13/chartex" xmlns:cx8="http://schemas.microsoft.com/office/drawing/2016/5/14/chartex" xmlns:mc="http://schemas.openxmlformats.org/markup-compatibility/2006" xmlns:aink="http://schemas.microsoft.com/office/drawing/2016/ink" xmlns:am3d="http://schemas.microsoft.com/office/drawing/2017/model3d" xmlns:o="urn:schemas-microsoft-com:office:office" xmlns:oel="http://schemas.microsoft.com/office/2019/extlst" xmlns:r="http://schemas.openxmlformats.org/officeDocument/2006/relationships" xmlns:m="http://schemas.openxmlformats.org/officeDocument/2006/math" xmlns:v="urn:schemas-microsoft-com:vml" xmlns:wp14="http://schemas.microsoft.com/office/word/2010/wordprocessingDrawing" xmlns:wp="http://schemas.openxmlformats.org/drawingml/2006/wordprocessingDrawing" xmlns:w10="urn:schemas-microsoft-com:office:word" xmlns:w="http://schemas.openxmlformats.org/wordprocessingml/2006/main" xmlns:w14="http://schemas.microsoft.com/office/word/2010/wordml" xmlns:w15="http://schemas.microsoft.com/office/word/2012/wordml" xmlns:w16cex="http://schemas.microsoft.com/office/word/2018/wordml/cex" xmlns:w16cid="http://schemas.microsoft.com/office/word/2016/wordml/cid" xmlns:w16="http://schemas.microsoft.com/office/word/2018/wordml" xmlns:w16du="http://schemas.microsoft.com/office/word/2023/wordml/word16du" xmlns:w16sdtdh="http://schemas.microsoft.com/office/word/2020/wordml/sdtdatahash" xmlns:w16se="http://schemas.microsoft.com/office/word/2015/wordml/symex" xmlns:wpg="http://schemas.microsoft.com/office/word/2010/wordprocessingGroup" xmlns:wpi="http://schemas.microsoft.com/office/word/2010/wordprocessingInk" xmlns:wne="http://schemas.microsoft.com/office/word/2006/wordml" xmlns:wps="http://schemas.microsoft.com/office/word/2010/wordprocessingShape" mc:Ignorable="w14 w15 w16se w16cid w16 w16cex w16sdtdh wp14">
   <w:p>
     <w:pPr>
       <w:pStyle w:val="Footer"/>
@@ -2140,7 +2199,7 @@
 </file>
 
 <file path=word/footer2.xml><?xml version="1.0" encoding="utf-8"?>
-<w:ftr xmlns:wpc="http://schemas.microsoft.com/office/word/2010/wordprocessingCanvas" xmlns:cx="http://schemas.microsoft.com/office/drawing/2014/chartex" xmlns:cx1="http://schemas.microsoft.com/office/drawing/2015/9/8/chartex" xmlns:cx2="http://schemas.microsoft.com/office/drawing/2015/10/21/chartex" xmlns:cx3="http://schemas.microsoft.com/office/drawing/2016/5/9/chartex" xmlns:cx4="http://schemas.microsoft.com/office/drawing/2016/5/10/chartex" xmlns:cx5="http://schemas.microsoft.com/office/drawing/2016/5/11/chartex" xmlns:cx6="http://schemas.microsoft.com/office/drawing/2016/5/12/chartex" xmlns:cx7="http://schemas.microsoft.com/office/drawing/2016/5/13/chartex" xmlns:cx8="http://schemas.microsoft.com/office/drawing/2016/5/14/chartex" xmlns:mc="http://schemas.openxmlformats.org/markup-compatibility/2006" xmlns:aink="http://schemas.microsoft.com/office/drawing/2016/ink" xmlns:am3d="http://schemas.microsoft.com/office/drawing/2017/model3d" xmlns:o="urn:schemas-microsoft-com:office:office" xmlns:oel="http://schemas.microsoft.com/office/2019/extlst" xmlns:r="http://schemas.openxmlformats.org/officeDocument/2006/relationships" xmlns:m="http://schemas.openxmlformats.org/officeDocument/2006/math" xmlns:v="urn:schemas-microsoft-com:vml" xmlns:wp14="http://schemas.microsoft.com/office/word/2010/wordprocessingDrawing" xmlns:wp="http://schemas.openxmlformats.org/drawingml/2006/wordprocessingDrawing" xmlns:w10="urn:schemas-microsoft-com:office:word" xmlns:w="http://schemas.openxmlformats.org/wordprocessingml/2006/main" xmlns:w14="http://schemas.microsoft.com/office/word/2010/wordml" xmlns:w15="http://schemas.microsoft.com/office/word/2012/wordml" xmlns:w16cex="http://schemas.microsoft.com/office/word/2018/wordml/cex" xmlns:w16cid="http://schemas.microsoft.com/office/word/2016/wordml/cid" xmlns:w16="http://schemas.microsoft.com/office/word/2018/wordml" xmlns:w16du="http://schemas.microsoft.com/office/word/2023/wordml/word16du" xmlns:w16sdtdh="http://schemas.microsoft.com/office/word/2020/wordml/sdtdatahash" xmlns:w16sdtfl="http://schemas.microsoft.com/office/word/2024/wordml/sdtformatlock" xmlns:w16se="http://schemas.microsoft.com/office/word/2015/wordml/symex" xmlns:wpg="http://schemas.microsoft.com/office/word/2010/wordprocessingGroup" xmlns:wpi="http://schemas.microsoft.com/office/word/2010/wordprocessingInk" xmlns:wne="http://schemas.microsoft.com/office/word/2006/wordml" xmlns:wps="http://schemas.microsoft.com/office/word/2010/wordprocessingShape" mc:Ignorable="w14 w15 w16se w16cid w16 w16cex w16sdtdh w16sdtfl w16du wp14">
+<w:ftr xmlns:wpc="http://schemas.microsoft.com/office/word/2010/wordprocessingCanvas" xmlns:cx="http://schemas.microsoft.com/office/drawing/2014/chartex" xmlns:cx1="http://schemas.microsoft.com/office/drawing/2015/9/8/chartex" xmlns:cx2="http://schemas.microsoft.com/office/drawing/2015/10/21/chartex" xmlns:cx3="http://schemas.microsoft.com/office/drawing/2016/5/9/chartex" xmlns:cx4="http://schemas.microsoft.com/office/drawing/2016/5/10/chartex" xmlns:cx5="http://schemas.microsoft.com/office/drawing/2016/5/11/chartex" xmlns:cx6="http://schemas.microsoft.com/office/drawing/2016/5/12/chartex" xmlns:cx7="http://schemas.microsoft.com/office/drawing/2016/5/13/chartex" xmlns:cx8="http://schemas.microsoft.com/office/drawing/2016/5/14/chartex" xmlns:mc="http://schemas.openxmlformats.org/markup-compatibility/2006" xmlns:aink="http://schemas.microsoft.com/office/drawing/2016/ink" xmlns:am3d="http://schemas.microsoft.com/office/drawing/2017/model3d" xmlns:o="urn:schemas-microsoft-com:office:office" xmlns:oel="http://schemas.microsoft.com/office/2019/extlst" xmlns:r="http://schemas.openxmlformats.org/officeDocument/2006/relationships" xmlns:m="http://schemas.openxmlformats.org/officeDocument/2006/math" xmlns:v="urn:schemas-microsoft-com:vml" xmlns:wp14="http://schemas.microsoft.com/office/word/2010/wordprocessingDrawing" xmlns:wp="http://schemas.openxmlformats.org/drawingml/2006/wordprocessingDrawing" xmlns:w10="urn:schemas-microsoft-com:office:word" xmlns:w="http://schemas.openxmlformats.org/wordprocessingml/2006/main" xmlns:w14="http://schemas.microsoft.com/office/word/2010/wordml" xmlns:w15="http://schemas.microsoft.com/office/word/2012/wordml" xmlns:w16cex="http://schemas.microsoft.com/office/word/2018/wordml/cex" xmlns:w16cid="http://schemas.microsoft.com/office/word/2016/wordml/cid" xmlns:w16="http://schemas.microsoft.com/office/word/2018/wordml" xmlns:w16du="http://schemas.microsoft.com/office/word/2023/wordml/word16du" xmlns:w16sdtdh="http://schemas.microsoft.com/office/word/2020/wordml/sdtdatahash" xmlns:w16se="http://schemas.microsoft.com/office/word/2015/wordml/symex" xmlns:wpg="http://schemas.microsoft.com/office/word/2010/wordprocessingGroup" xmlns:wpi="http://schemas.microsoft.com/office/word/2010/wordprocessingInk" xmlns:wne="http://schemas.microsoft.com/office/word/2006/wordml" xmlns:wps="http://schemas.microsoft.com/office/word/2010/wordprocessingShape" mc:Ignorable="w14 w15 w16se w16cid w16 w16cex w16sdtdh wp14">
   <w:p>
     <w:pPr>
       <w:pStyle w:val="Footer"/>
@@ -2153,7 +2212,7 @@
 </file>
 
 <file path=word/footnotes.xml><?xml version="1.0" encoding="utf-8"?>
-<w:footnotes xmlns:wpc="http://schemas.microsoft.com/office/word/2010/wordprocessingCanvas" xmlns:cx="http://schemas.microsoft.com/office/drawing/2014/chartex" xmlns:cx1="http://schemas.microsoft.com/office/drawing/2015/9/8/chartex" xmlns:cx2="http://schemas.microsoft.com/office/drawing/2015/10/21/chartex" xmlns:cx3="http://schemas.microsoft.com/office/drawing/2016/5/9/chartex" xmlns:cx4="http://schemas.microsoft.com/office/drawing/2016/5/10/chartex" xmlns:cx5="http://schemas.microsoft.com/office/drawing/2016/5/11/chartex" xmlns:cx6="http://schemas.microsoft.com/office/drawing/2016/5/12/chartex" xmlns:cx7="http://schemas.microsoft.com/office/drawing/2016/5/13/chartex" xmlns:cx8="http://schemas.microsoft.com/office/drawing/2016/5/14/chartex" xmlns:mc="http://schemas.openxmlformats.org/markup-compatibility/2006" xmlns:aink="http://schemas.microsoft.com/office/drawing/2016/ink" xmlns:am3d="http://schemas.microsoft.com/office/drawing/2017/model3d" xmlns:o="urn:schemas-microsoft-com:office:office" xmlns:oel="http://schemas.microsoft.com/office/2019/extlst" xmlns:r="http://schemas.openxmlformats.org/officeDocument/2006/relationships" xmlns:m="http://schemas.openxmlformats.org/officeDocument/2006/math" xmlns:v="urn:schemas-microsoft-com:vml" xmlns:wp14="http://schemas.microsoft.com/office/word/2010/wordprocessingDrawing" xmlns:wp="http://schemas.openxmlformats.org/drawingml/2006/wordprocessingDrawing" xmlns:w10="urn:schemas-microsoft-com:office:word" xmlns:w="http://schemas.openxmlformats.org/wordprocessingml/2006/main" xmlns:w14="http://schemas.microsoft.com/office/word/2010/wordml" xmlns:w15="http://schemas.microsoft.com/office/word/2012/wordml" xmlns:w16cex="http://schemas.microsoft.com/office/word/2018/wordml/cex" xmlns:w16cid="http://schemas.microsoft.com/office/word/2016/wordml/cid" xmlns:w16="http://schemas.microsoft.com/office/word/2018/wordml" xmlns:w16du="http://schemas.microsoft.com/office/word/2023/wordml/word16du" xmlns:w16sdtdh="http://schemas.microsoft.com/office/word/2020/wordml/sdtdatahash" xmlns:w16sdtfl="http://schemas.microsoft.com/office/word/2024/wordml/sdtformatlock" xmlns:w16se="http://schemas.microsoft.com/office/word/2015/wordml/symex" xmlns:wpg="http://schemas.microsoft.com/office/word/2010/wordprocessingGroup" xmlns:wpi="http://schemas.microsoft.com/office/word/2010/wordprocessingInk" xmlns:wne="http://schemas.microsoft.com/office/word/2006/wordml" xmlns:wps="http://schemas.microsoft.com/office/word/2010/wordprocessingShape" mc:Ignorable="w14 w15 w16se w16cid w16 w16cex w16sdtdh w16sdtfl w16du wp14">
+<w:footnotes xmlns:wpc="http://schemas.microsoft.com/office/word/2010/wordprocessingCanvas" xmlns:cx="http://schemas.microsoft.com/office/drawing/2014/chartex" xmlns:cx1="http://schemas.microsoft.com/office/drawing/2015/9/8/chartex" xmlns:cx2="http://schemas.microsoft.com/office/drawing/2015/10/21/chartex" xmlns:cx3="http://schemas.microsoft.com/office/drawing/2016/5/9/chartex" xmlns:cx4="http://schemas.microsoft.com/office/drawing/2016/5/10/chartex" xmlns:cx5="http://schemas.microsoft.com/office/drawing/2016/5/11/chartex" xmlns:cx6="http://schemas.microsoft.com/office/drawing/2016/5/12/chartex" xmlns:cx7="http://schemas.microsoft.com/office/drawing/2016/5/13/chartex" xmlns:cx8="http://schemas.microsoft.com/office/drawing/2016/5/14/chartex" xmlns:mc="http://schemas.openxmlformats.org/markup-compatibility/2006" xmlns:aink="http://schemas.microsoft.com/office/drawing/2016/ink" xmlns:am3d="http://schemas.microsoft.com/office/drawing/2017/model3d" xmlns:o="urn:schemas-microsoft-com:office:office" xmlns:oel="http://schemas.microsoft.com/office/2019/extlst" xmlns:r="http://schemas.openxmlformats.org/officeDocument/2006/relationships" xmlns:m="http://schemas.openxmlformats.org/officeDocument/2006/math" xmlns:v="urn:schemas-microsoft-com:vml" xmlns:wp14="http://schemas.microsoft.com/office/word/2010/wordprocessingDrawing" xmlns:wp="http://schemas.openxmlformats.org/drawingml/2006/wordprocessingDrawing" xmlns:w10="urn:schemas-microsoft-com:office:word" xmlns:w="http://schemas.openxmlformats.org/wordprocessingml/2006/main" xmlns:w14="http://schemas.microsoft.com/office/word/2010/wordml" xmlns:w15="http://schemas.microsoft.com/office/word/2012/wordml" xmlns:w16cex="http://schemas.microsoft.com/office/word/2018/wordml/cex" xmlns:w16cid="http://schemas.microsoft.com/office/word/2016/wordml/cid" xmlns:w16="http://schemas.microsoft.com/office/word/2018/wordml" xmlns:w16du="http://schemas.microsoft.com/office/word/2023/wordml/word16du" xmlns:w16sdtdh="http://schemas.microsoft.com/office/word/2020/wordml/sdtdatahash" xmlns:w16se="http://schemas.microsoft.com/office/word/2015/wordml/symex" xmlns:wpg="http://schemas.microsoft.com/office/word/2010/wordprocessingGroup" xmlns:wpi="http://schemas.microsoft.com/office/word/2010/wordprocessingInk" xmlns:wne="http://schemas.microsoft.com/office/word/2006/wordml" xmlns:wps="http://schemas.microsoft.com/office/word/2010/wordprocessingShape" mc:Ignorable="w14 w15 w16se w16cid w16 w16cex w16sdtdh wp14">
   <w:footnote w:type="separator" w:id="-1">
     <w:p>
       <w:r>
@@ -2172,7 +2231,7 @@
 </file>
 
 <file path=word/header1.xml><?xml version="1.0" encoding="utf-8"?>
-<w:hdr xmlns:wpc="http://schemas.microsoft.com/office/word/2010/wordprocessingCanvas" xmlns:cx="http://schemas.microsoft.com/office/drawing/2014/chartex" xmlns:cx1="http://schemas.microsoft.com/office/drawing/2015/9/8/chartex" xmlns:cx2="http://schemas.microsoft.com/office/drawing/2015/10/21/chartex" xmlns:cx3="http://schemas.microsoft.com/office/drawing/2016/5/9/chartex" xmlns:cx4="http://schemas.microsoft.com/office/drawing/2016/5/10/chartex" xmlns:cx5="http://schemas.microsoft.com/office/drawing/2016/5/11/chartex" xmlns:cx6="http://schemas.microsoft.com/office/drawing/2016/5/12/chartex" xmlns:cx7="http://schemas.microsoft.com/office/drawing/2016/5/13/chartex" xmlns:cx8="http://schemas.microsoft.com/office/drawing/2016/5/14/chartex" xmlns:mc="http://schemas.openxmlformats.org/markup-compatibility/2006" xmlns:aink="http://schemas.microsoft.com/office/drawing/2016/ink" xmlns:am3d="http://schemas.microsoft.com/office/drawing/2017/model3d" xmlns:o="urn:schemas-microsoft-com:office:office" xmlns:oel="http://schemas.microsoft.com/office/2019/extlst" xmlns:r="http://schemas.openxmlformats.org/officeDocument/2006/relationships" xmlns:m="http://schemas.openxmlformats.org/officeDocument/2006/math" xmlns:v="urn:schemas-microsoft-com:vml" xmlns:wp14="http://schemas.microsoft.com/office/word/2010/wordprocessingDrawing" xmlns:wp="http://schemas.openxmlformats.org/drawingml/2006/wordprocessingDrawing" xmlns:w10="urn:schemas-microsoft-com:office:word" xmlns:w="http://schemas.openxmlformats.org/wordprocessingml/2006/main" xmlns:w14="http://schemas.microsoft.com/office/word/2010/wordml" xmlns:w15="http://schemas.microsoft.com/office/word/2012/wordml" xmlns:w16cex="http://schemas.microsoft.com/office/word/2018/wordml/cex" xmlns:w16cid="http://schemas.microsoft.com/office/word/2016/wordml/cid" xmlns:w16="http://schemas.microsoft.com/office/word/2018/wordml" xmlns:w16du="http://schemas.microsoft.com/office/word/2023/wordml/word16du" xmlns:w16sdtdh="http://schemas.microsoft.com/office/word/2020/wordml/sdtdatahash" xmlns:w16sdtfl="http://schemas.microsoft.com/office/word/2024/wordml/sdtformatlock" xmlns:w16se="http://schemas.microsoft.com/office/word/2015/wordml/symex" xmlns:wpg="http://schemas.microsoft.com/office/word/2010/wordprocessingGroup" xmlns:wpi="http://schemas.microsoft.com/office/word/2010/wordprocessingInk" xmlns:wne="http://schemas.microsoft.com/office/word/2006/wordml" xmlns:wps="http://schemas.microsoft.com/office/word/2010/wordprocessingShape" mc:Ignorable="w14 w15 w16se w16cid w16 w16cex w16sdtdh w16sdtfl w16du wp14">
+<w:hdr xmlns:wpc="http://schemas.microsoft.com/office/word/2010/wordprocessingCanvas" xmlns:cx="http://schemas.microsoft.com/office/drawing/2014/chartex" xmlns:cx1="http://schemas.microsoft.com/office/drawing/2015/9/8/chartex" xmlns:cx2="http://schemas.microsoft.com/office/drawing/2015/10/21/chartex" xmlns:cx3="http://schemas.microsoft.com/office/drawing/2016/5/9/chartex" xmlns:cx4="http://schemas.microsoft.com/office/drawing/2016/5/10/chartex" xmlns:cx5="http://schemas.microsoft.com/office/drawing/2016/5/11/chartex" xmlns:cx6="http://schemas.microsoft.com/office/drawing/2016/5/12/chartex" xmlns:cx7="http://schemas.microsoft.com/office/drawing/2016/5/13/chartex" xmlns:cx8="http://schemas.microsoft.com/office/drawing/2016/5/14/chartex" xmlns:mc="http://schemas.openxmlformats.org/markup-compatibility/2006" xmlns:aink="http://schemas.microsoft.com/office/drawing/2016/ink" xmlns:am3d="http://schemas.microsoft.com/office/drawing/2017/model3d" xmlns:o="urn:schemas-microsoft-com:office:office" xmlns:oel="http://schemas.microsoft.com/office/2019/extlst" xmlns:r="http://schemas.openxmlformats.org/officeDocument/2006/relationships" xmlns:m="http://schemas.openxmlformats.org/officeDocument/2006/math" xmlns:v="urn:schemas-microsoft-com:vml" xmlns:wp14="http://schemas.microsoft.com/office/word/2010/wordprocessingDrawing" xmlns:wp="http://schemas.openxmlformats.org/drawingml/2006/wordprocessingDrawing" xmlns:w10="urn:schemas-microsoft-com:office:word" xmlns:w="http://schemas.openxmlformats.org/wordprocessingml/2006/main" xmlns:w14="http://schemas.microsoft.com/office/word/2010/wordml" xmlns:w15="http://schemas.microsoft.com/office/word/2012/wordml" xmlns:w16cex="http://schemas.microsoft.com/office/word/2018/wordml/cex" xmlns:w16cid="http://schemas.microsoft.com/office/word/2016/wordml/cid" xmlns:w16="http://schemas.microsoft.com/office/word/2018/wordml" xmlns:w16du="http://schemas.microsoft.com/office/word/2023/wordml/word16du" xmlns:w16sdtdh="http://schemas.microsoft.com/office/word/2020/wordml/sdtdatahash" xmlns:w16se="http://schemas.microsoft.com/office/word/2015/wordml/symex" xmlns:wpg="http://schemas.microsoft.com/office/word/2010/wordprocessingGroup" xmlns:wpi="http://schemas.microsoft.com/office/word/2010/wordprocessingInk" xmlns:wne="http://schemas.microsoft.com/office/word/2006/wordml" xmlns:wps="http://schemas.microsoft.com/office/word/2010/wordprocessingShape" mc:Ignorable="w14 w15 w16se w16cid w16 w16cex w16sdtdh wp14">
   <w:p>
     <w:pPr>
       <w:pStyle w:val="Header"/>
@@ -2209,7 +2268,7 @@
 </file>
 
 <file path=word/header2.xml><?xml version="1.0" encoding="utf-8"?>
-<w:hdr xmlns:wpc="http://schemas.microsoft.com/office/word/2010/wordprocessingCanvas" xmlns:cx="http://schemas.microsoft.com/office/drawing/2014/chartex" xmlns:cx1="http://schemas.microsoft.com/office/drawing/2015/9/8/chartex" xmlns:cx2="http://schemas.microsoft.com/office/drawing/2015/10/21/chartex" xmlns:cx3="http://schemas.microsoft.com/office/drawing/2016/5/9/chartex" xmlns:cx4="http://schemas.microsoft.com/office/drawing/2016/5/10/chartex" xmlns:cx5="http://schemas.microsoft.com/office/drawing/2016/5/11/chartex" xmlns:cx6="http://schemas.microsoft.com/office/drawing/2016/5/12/chartex" xmlns:cx7="http://schemas.microsoft.com/office/drawing/2016/5/13/chartex" xmlns:cx8="http://schemas.microsoft.com/office/drawing/2016/5/14/chartex" xmlns:mc="http://schemas.openxmlformats.org/markup-compatibility/2006" xmlns:aink="http://schemas.microsoft.com/office/drawing/2016/ink" xmlns:am3d="http://schemas.microsoft.com/office/drawing/2017/model3d" xmlns:o="urn:schemas-microsoft-com:office:office" xmlns:oel="http://schemas.microsoft.com/office/2019/extlst" xmlns:r="http://schemas.openxmlformats.org/officeDocument/2006/relationships" xmlns:m="http://schemas.openxmlformats.org/officeDocument/2006/math" xmlns:v="urn:schemas-microsoft-com:vml" xmlns:wp14="http://schemas.microsoft.com/office/word/2010/wordprocessingDrawing" xmlns:wp="http://schemas.openxmlformats.org/drawingml/2006/wordprocessingDrawing" xmlns:w10="urn:schemas-microsoft-com:office:word" xmlns:w="http://schemas.openxmlformats.org/wordprocessingml/2006/main" xmlns:w14="http://schemas.microsoft.com/office/word/2010/wordml" xmlns:w15="http://schemas.microsoft.com/office/word/2012/wordml" xmlns:w16cex="http://schemas.microsoft.com/office/word/2018/wordml/cex" xmlns:w16cid="http://schemas.microsoft.com/office/word/2016/wordml/cid" xmlns:w16="http://schemas.microsoft.com/office/word/2018/wordml" xmlns:w16du="http://schemas.microsoft.com/office/word/2023/wordml/word16du" xmlns:w16sdtdh="http://schemas.microsoft.com/office/word/2020/wordml/sdtdatahash" xmlns:w16sdtfl="http://schemas.microsoft.com/office/word/2024/wordml/sdtformatlock" xmlns:w16se="http://schemas.microsoft.com/office/word/2015/wordml/symex" xmlns:wpg="http://schemas.microsoft.com/office/word/2010/wordprocessingGroup" xmlns:wpi="http://schemas.microsoft.com/office/word/2010/wordprocessingInk" xmlns:wne="http://schemas.microsoft.com/office/word/2006/wordml" xmlns:wps="http://schemas.microsoft.com/office/word/2010/wordprocessingShape" mc:Ignorable="w14 w15 w16se w16cid w16 w16cex w16sdtdh w16sdtfl w16du wp14">
+<w:hdr xmlns:wpc="http://schemas.microsoft.com/office/word/2010/wordprocessingCanvas" xmlns:cx="http://schemas.microsoft.com/office/drawing/2014/chartex" xmlns:cx1="http://schemas.microsoft.com/office/drawing/2015/9/8/chartex" xmlns:cx2="http://schemas.microsoft.com/office/drawing/2015/10/21/chartex" xmlns:cx3="http://schemas.microsoft.com/office/drawing/2016/5/9/chartex" xmlns:cx4="http://schemas.microsoft.com/office/drawing/2016/5/10/chartex" xmlns:cx5="http://schemas.microsoft.com/office/drawing/2016/5/11/chartex" xmlns:cx6="http://schemas.microsoft.com/office/drawing/2016/5/12/chartex" xmlns:cx7="http://schemas.microsoft.com/office/drawing/2016/5/13/chartex" xmlns:cx8="http://schemas.microsoft.com/office/drawing/2016/5/14/chartex" xmlns:mc="http://schemas.openxmlformats.org/markup-compatibility/2006" xmlns:aink="http://schemas.microsoft.com/office/drawing/2016/ink" xmlns:am3d="http://schemas.microsoft.com/office/drawing/2017/model3d" xmlns:o="urn:schemas-microsoft-com:office:office" xmlns:oel="http://schemas.microsoft.com/office/2019/extlst" xmlns:r="http://schemas.openxmlformats.org/officeDocument/2006/relationships" xmlns:m="http://schemas.openxmlformats.org/officeDocument/2006/math" xmlns:v="urn:schemas-microsoft-com:vml" xmlns:wp14="http://schemas.microsoft.com/office/word/2010/wordprocessingDrawing" xmlns:wp="http://schemas.openxmlformats.org/drawingml/2006/wordprocessingDrawing" xmlns:w10="urn:schemas-microsoft-com:office:word" xmlns:w="http://schemas.openxmlformats.org/wordprocessingml/2006/main" xmlns:w14="http://schemas.microsoft.com/office/word/2010/wordml" xmlns:w15="http://schemas.microsoft.com/office/word/2012/wordml" xmlns:w16cex="http://schemas.microsoft.com/office/word/2018/wordml/cex" xmlns:w16cid="http://schemas.microsoft.com/office/word/2016/wordml/cid" xmlns:w16="http://schemas.microsoft.com/office/word/2018/wordml" xmlns:w16du="http://schemas.microsoft.com/office/word/2023/wordml/word16du" xmlns:w16sdtdh="http://schemas.microsoft.com/office/word/2020/wordml/sdtdatahash" xmlns:w16se="http://schemas.microsoft.com/office/word/2015/wordml/symex" xmlns:wpg="http://schemas.microsoft.com/office/word/2010/wordprocessingGroup" xmlns:wpi="http://schemas.microsoft.com/office/word/2010/wordprocessingInk" xmlns:wne="http://schemas.microsoft.com/office/word/2006/wordml" xmlns:wps="http://schemas.microsoft.com/office/word/2010/wordprocessingShape" mc:Ignorable="w14 w15 w16se w16cid w16 w16cex w16sdtdh wp14">
   <w:p>
     <w:pPr>
       <w:pStyle w:val="Header"/>
@@ -2264,7 +2323,7 @@
 </file>
 
 <file path=word/numbering.xml><?xml version="1.0" encoding="utf-8"?>
-<w:numbering xmlns:wpc="http://schemas.microsoft.com/office/word/2010/wordprocessingCanvas" xmlns:cx="http://schemas.microsoft.com/office/drawing/2014/chartex" xmlns:cx1="http://schemas.microsoft.com/office/drawing/2015/9/8/chartex" xmlns:cx2="http://schemas.microsoft.com/office/drawing/2015/10/21/chartex" xmlns:cx3="http://schemas.microsoft.com/office/drawing/2016/5/9/chartex" xmlns:cx4="http://schemas.microsoft.com/office/drawing/2016/5/10/chartex" xmlns:cx5="http://schemas.microsoft.com/office/drawing/2016/5/11/chartex" xmlns:cx6="http://schemas.microsoft.com/office/drawing/2016/5/12/chartex" xmlns:cx7="http://schemas.microsoft.com/office/drawing/2016/5/13/chartex" xmlns:cx8="http://schemas.microsoft.com/office/drawing/2016/5/14/chartex" xmlns:mc="http://schemas.openxmlformats.org/markup-compatibility/2006" xmlns:aink="http://schemas.microsoft.com/office/drawing/2016/ink" xmlns:am3d="http://schemas.microsoft.com/office/drawing/2017/model3d" xmlns:o="urn:schemas-microsoft-com:office:office" xmlns:oel="http://schemas.microsoft.com/office/2019/extlst" xmlns:r="http://schemas.openxmlformats.org/officeDocument/2006/relationships" xmlns:m="http://schemas.openxmlformats.org/officeDocument/2006/math" xmlns:v="urn:schemas-microsoft-com:vml" xmlns:wp14="http://schemas.microsoft.com/office/word/2010/wordprocessingDrawing" xmlns:wp="http://schemas.openxmlformats.org/drawingml/2006/wordprocessingDrawing" xmlns:w10="urn:schemas-microsoft-com:office:word" xmlns:w="http://schemas.openxmlformats.org/wordprocessingml/2006/main" xmlns:w14="http://schemas.microsoft.com/office/word/2010/wordml" xmlns:w15="http://schemas.microsoft.com/office/word/2012/wordml" xmlns:w16cex="http://schemas.microsoft.com/office/word/2018/wordml/cex" xmlns:w16cid="http://schemas.microsoft.com/office/word/2016/wordml/cid" xmlns:w16="http://schemas.microsoft.com/office/word/2018/wordml" xmlns:w16du="http://schemas.microsoft.com/office/word/2023/wordml/word16du" xmlns:w16sdtdh="http://schemas.microsoft.com/office/word/2020/wordml/sdtdatahash" xmlns:w16sdtfl="http://schemas.microsoft.com/office/word/2024/wordml/sdtformatlock" xmlns:w16se="http://schemas.microsoft.com/office/word/2015/wordml/symex" xmlns:wpg="http://schemas.microsoft.com/office/word/2010/wordprocessingGroup" xmlns:wpi="http://schemas.microsoft.com/office/word/2010/wordprocessingInk" xmlns:wne="http://schemas.microsoft.com/office/word/2006/wordml" xmlns:wps="http://schemas.microsoft.com/office/word/2010/wordprocessingShape" mc:Ignorable="w14 w15 w16se w16cid w16 w16cex w16sdtdh w16sdtfl w16du wp14">
+<w:numbering xmlns:wpc="http://schemas.microsoft.com/office/word/2010/wordprocessingCanvas" xmlns:cx="http://schemas.microsoft.com/office/drawing/2014/chartex" xmlns:cx1="http://schemas.microsoft.com/office/drawing/2015/9/8/chartex" xmlns:cx2="http://schemas.microsoft.com/office/drawing/2015/10/21/chartex" xmlns:cx3="http://schemas.microsoft.com/office/drawing/2016/5/9/chartex" xmlns:cx4="http://schemas.microsoft.com/office/drawing/2016/5/10/chartex" xmlns:cx5="http://schemas.microsoft.com/office/drawing/2016/5/11/chartex" xmlns:cx6="http://schemas.microsoft.com/office/drawing/2016/5/12/chartex" xmlns:cx7="http://schemas.microsoft.com/office/drawing/2016/5/13/chartex" xmlns:cx8="http://schemas.microsoft.com/office/drawing/2016/5/14/chartex" xmlns:mc="http://schemas.openxmlformats.org/markup-compatibility/2006" xmlns:aink="http://schemas.microsoft.com/office/drawing/2016/ink" xmlns:am3d="http://schemas.microsoft.com/office/drawing/2017/model3d" xmlns:o="urn:schemas-microsoft-com:office:office" xmlns:oel="http://schemas.microsoft.com/office/2019/extlst" xmlns:r="http://schemas.openxmlformats.org/officeDocument/2006/relationships" xmlns:m="http://schemas.openxmlformats.org/officeDocument/2006/math" xmlns:v="urn:schemas-microsoft-com:vml" xmlns:wp14="http://schemas.microsoft.com/office/word/2010/wordprocessingDrawing" xmlns:wp="http://schemas.openxmlformats.org/drawingml/2006/wordprocessingDrawing" xmlns:w10="urn:schemas-microsoft-com:office:word" xmlns:w="http://schemas.openxmlformats.org/wordprocessingml/2006/main" xmlns:w14="http://schemas.microsoft.com/office/word/2010/wordml" xmlns:w15="http://schemas.microsoft.com/office/word/2012/wordml" xmlns:w16cex="http://schemas.microsoft.com/office/word/2018/wordml/cex" xmlns:w16cid="http://schemas.microsoft.com/office/word/2016/wordml/cid" xmlns:w16="http://schemas.microsoft.com/office/word/2018/wordml" xmlns:w16du="http://schemas.microsoft.com/office/word/2023/wordml/word16du" xmlns:w16sdtdh="http://schemas.microsoft.com/office/word/2020/wordml/sdtdatahash" xmlns:w16se="http://schemas.microsoft.com/office/word/2015/wordml/symex" xmlns:wpg="http://schemas.microsoft.com/office/word/2010/wordprocessingGroup" xmlns:wpi="http://schemas.microsoft.com/office/word/2010/wordprocessingInk" xmlns:wne="http://schemas.microsoft.com/office/word/2006/wordml" xmlns:wps="http://schemas.microsoft.com/office/word/2010/wordprocessingShape" mc:Ignorable="w14 w15 w16se w16cid w16 w16cex w16sdtdh wp14">
   <w:abstractNum w:abstractNumId="0" w15:restartNumberingAfterBreak="0">
     <w:nsid w:val="1E3765FD"/>
     <w:multiLevelType w:val="hybridMultilevel"/>
@@ -2767,7 +2826,7 @@
 </file>
 
 <file path=word/styles.xml><?xml version="1.0" encoding="utf-8"?>
-<w:styles xmlns:mc="http://schemas.openxmlformats.org/markup-compatibility/2006" xmlns:r="http://schemas.openxmlformats.org/officeDocument/2006/relationships" xmlns:w="http://schemas.openxmlformats.org/wordprocessingml/2006/main" xmlns:w14="http://schemas.microsoft.com/office/word/2010/wordml" xmlns:w15="http://schemas.microsoft.com/office/word/2012/wordml" xmlns:w16cex="http://schemas.microsoft.com/office/word/2018/wordml/cex" xmlns:w16cid="http://schemas.microsoft.com/office/word/2016/wordml/cid" xmlns:w16="http://schemas.microsoft.com/office/word/2018/wordml" xmlns:w16du="http://schemas.microsoft.com/office/word/2023/wordml/word16du" xmlns:w16sdtdh="http://schemas.microsoft.com/office/word/2020/wordml/sdtdatahash" xmlns:w16sdtfl="http://schemas.microsoft.com/office/word/2024/wordml/sdtformatlock" xmlns:w16se="http://schemas.microsoft.com/office/word/2015/wordml/symex" mc:Ignorable="w14 w15 w16se w16cid w16 w16cex w16sdtdh w16sdtfl w16du">
+<w:styles xmlns:mc="http://schemas.openxmlformats.org/markup-compatibility/2006" xmlns:r="http://schemas.openxmlformats.org/officeDocument/2006/relationships" xmlns:w="http://schemas.openxmlformats.org/wordprocessingml/2006/main" xmlns:w14="http://schemas.microsoft.com/office/word/2010/wordml" xmlns:w15="http://schemas.microsoft.com/office/word/2012/wordml" xmlns:w16cex="http://schemas.microsoft.com/office/word/2018/wordml/cex" xmlns:w16cid="http://schemas.microsoft.com/office/word/2016/wordml/cid" xmlns:w16="http://schemas.microsoft.com/office/word/2018/wordml" xmlns:w16sdtdh="http://schemas.microsoft.com/office/word/2020/wordml/sdtdatahash" xmlns:w16se="http://schemas.microsoft.com/office/word/2015/wordml/symex" mc:Ignorable="w14 w15 w16se w16cid w16 w16cex w16sdtdh">
   <w:docDefaults>
     <w:rPrDefault>
       <w:rPr>

</xml_diff>